<commit_message>
Update the story from the revised article text
Add the evening pineal gland step, the closing note on chronotypes,
and show the afternoon prefrontal dip as the same shape in a paler blue.

Co-Authored-By: Claude Opus 5.5 <noreply@anthropic.com>
</commit_message>
<xml_diff>
--- a/24 godziny mózg informacje do grafiki.docx
+++ b/24 godziny mózg informacje do grafiki.docx
@@ -1,73 +1,116 @@
 
 <file path=word/document.xml><?xml version="1.0" encoding="utf-8"?>
-<w:document xmlns:wpc="http://schemas.microsoft.com/office/word/2010/wordprocessingCanvas" xmlns:cx="http://schemas.microsoft.com/office/drawing/2014/chartex" xmlns:cx1="http://schemas.microsoft.com/office/drawing/2015/9/8/chartex" xmlns:cx2="http://schemas.microsoft.com/office/drawing/2015/10/21/chartex" xmlns:cx3="http://schemas.microsoft.com/office/drawing/2016/5/9/chartex" xmlns:cx4="http://schemas.microsoft.com/office/drawing/2016/5/10/chartex" xmlns:cx5="http://schemas.microsoft.com/office/drawing/2016/5/11/chartex" xmlns:cx6="http://schemas.microsoft.com/office/drawing/2016/5/12/chartex" xmlns:cx7="http://schemas.microsoft.com/office/drawing/2016/5/13/chartex" xmlns:cx8="http://schemas.microsoft.com/office/drawing/2016/5/14/chartex" xmlns:mc="http://schemas.openxmlformats.org/markup-compatibility/2006" xmlns:aink="http://schemas.microsoft.com/office/drawing/2016/ink" xmlns:am3d="http://schemas.microsoft.com/office/drawing/2017/model3d" xmlns:o="urn:schemas-microsoft-com:office:office" xmlns:oel="http://schemas.microsoft.com/office/2019/extlst" xmlns:r="http://schemas.openxmlformats.org/officeDocument/2006/relationships" xmlns:m="http://schemas.openxmlformats.org/officeDocument/2006/math" xmlns:v="urn:schemas-microsoft-com:vml" xmlns:wp14="http://schemas.microsoft.com/office/word/2010/wordprocessingDrawing" xmlns:wp="http://schemas.openxmlformats.org/drawingml/2006/wordprocessingDrawing" xmlns:w10="urn:schemas-microsoft-com:office:word" xmlns:w="http://schemas.openxmlformats.org/wordprocessingml/2006/main" xmlns:w14="http://schemas.microsoft.com/office/word/2010/wordml" xmlns:w15="http://schemas.microsoft.com/office/word/2012/wordml" xmlns:w16cex="http://schemas.microsoft.com/office/word/2018/wordml/cex" xmlns:w16cid="http://schemas.microsoft.com/office/word/2016/wordml/cid" xmlns:w16="http://schemas.microsoft.com/office/word/2018/wordml" xmlns:w16du="http://schemas.microsoft.com/office/word/2023/wordml/word16du" xmlns:w16sdtdh="http://schemas.microsoft.com/office/word/2020/wordml/sdtdatahash" xmlns:w16sdtfl="http://schemas.microsoft.com/office/word/2024/wordml/sdtformatlock" xmlns:w16se="http://schemas.microsoft.com/office/word/2015/wordml/symex" xmlns:wpg="http://schemas.microsoft.com/office/word/2010/wordprocessingGroup" xmlns:wpi="http://schemas.microsoft.com/office/word/2010/wordprocessingInk" xmlns:wne="http://schemas.microsoft.com/office/word/2006/wordml" xmlns:wps="http://schemas.microsoft.com/office/word/2010/wordprocessingShape" mc:Ignorable="w14 w15 w16se w16cid w16 w16cex w16sdtdh w16sdtfl w16du wp14">
+<w:document xmlns:wpc="http://schemas.microsoft.com/office/word/2010/wordprocessingCanvas" xmlns:cx="http://schemas.microsoft.com/office/drawing/2014/chartex" xmlns:cx1="http://schemas.microsoft.com/office/drawing/2015/9/8/chartex" xmlns:cx2="http://schemas.microsoft.com/office/drawing/2015/10/21/chartex" xmlns:cx3="http://schemas.microsoft.com/office/drawing/2016/5/9/chartex" xmlns:cx4="http://schemas.microsoft.com/office/drawing/2016/5/10/chartex" xmlns:cx5="http://schemas.microsoft.com/office/drawing/2016/5/11/chartex" xmlns:cx6="http://schemas.microsoft.com/office/drawing/2016/5/12/chartex" xmlns:cx7="http://schemas.microsoft.com/office/drawing/2016/5/13/chartex" xmlns:cx8="http://schemas.microsoft.com/office/drawing/2016/5/14/chartex" xmlns:mc="http://schemas.openxmlformats.org/markup-compatibility/2006" xmlns:m="http://schemas.openxmlformats.org/officeDocument/2006/math" xmlns:aink="http://schemas.microsoft.com/office/drawing/2016/ink" xmlns:am3d="http://schemas.microsoft.com/office/drawing/2017/model3d" xmlns:oel="http://schemas.microsoft.com/office/2019/extlst" xmlns:r="http://schemas.openxmlformats.org/officeDocument/2006/relationships" xmlns:wp14="http://schemas.microsoft.com/office/word/2010/wordprocessingDrawing" xmlns:wp="http://schemas.openxmlformats.org/drawingml/2006/wordprocessingDrawing" xmlns:wpg="http://schemas.microsoft.com/office/word/2010/wordprocessingGroup" xmlns:wpi="http://schemas.microsoft.com/office/word/2010/wordprocessingInk" xmlns:wps="http://schemas.microsoft.com/office/word/2010/wordprocessingShape" xmlns:o="urn:schemas-microsoft-com:office:office" xmlns:v="urn:schemas-microsoft-com:vml" xmlns:w10="urn:schemas-microsoft-com:office:word" xmlns:w="http://schemas.openxmlformats.org/wordprocessingml/2006/main" xmlns:w14="http://schemas.microsoft.com/office/word/2010/wordml" xmlns:w15="http://schemas.microsoft.com/office/word/2012/wordml" xmlns:w16cex="http://schemas.microsoft.com/office/word/2018/wordml/cex" xmlns:w16cid="http://schemas.microsoft.com/office/word/2016/wordml/cid" xmlns:w16="http://schemas.microsoft.com/office/word/2018/wordml" xmlns:w16sdtdh="http://schemas.microsoft.com/office/word/2020/wordml/sdtdatahash" xmlns:w16sdtfl="http://schemas.microsoft.com/office/word/2024/wordml/sdtformatlock" xmlns:w16se="http://schemas.microsoft.com/office/word/2015/wordml/symex" xmlns:w16du="http://schemas.microsoft.com/office/word/2023/wordml/word16du" xmlns:wne="http://schemas.microsoft.com/office/word/2006/wordml" mc:Ignorable="w14 w15 w16se w16cid w16 w16cex w16sdtdh w16sdtfl w16du wp14">
   <w:body>
     <w:p>
       <w:pPr>
         <w:rPr>
+          <w:rFonts w:ascii="Lato" w:eastAsia="Lato" w:hAnsi="Lato" w:cs="Lato"/>
+          <w:color w:val="FF0000"/>
+          <w:sz w:val="22"/>
+          <w:szCs w:val="22"/>
+        </w:rPr>
+      </w:pPr>
+      <w:r>
+        <w:rPr>
           <w:b/>
           <w:bCs/>
         </w:rPr>
-      </w:pPr>
+        <w:t>Przypis/uwaga na koniec do dodania</w:t>
+      </w:r>
+      <w:proofErr w:type="gramStart"/>
       <w:r>
         <w:rPr>
           <w:b/>
           <w:bCs/>
         </w:rPr>
-        <w:t xml:space="preserve">1. Rano i przedpołudnie (godz. 6:00 – 12:00) </w:t>
+        <w:t xml:space="preserve">: </w:t>
+      </w:r>
+      <w:r>
+        <w:rPr>
+          <w:rFonts w:ascii="Lato" w:eastAsia="Lato" w:hAnsi="Lato" w:cs="Lato"/>
+          <w:i/>
+          <w:iCs/>
+          <w:sz w:val="22"/>
+          <w:szCs w:val="22"/>
+        </w:rPr>
+        <w:t>.</w:t>
+      </w:r>
+      <w:proofErr w:type="gramEnd"/>
+      <w:r>
+        <w:rPr>
+          <w:rFonts w:ascii="Lato" w:eastAsia="Lato" w:hAnsi="Lato" w:cs="Lato"/>
+          <w:i/>
+          <w:iCs/>
+          <w:sz w:val="22"/>
+          <w:szCs w:val="22"/>
+        </w:rPr>
+        <w:t xml:space="preserve"> Do grafiki wybraliśmy obszary mózgu, które są warte podkreślenia o danej porze dnia. Nie oznacza to, że inne obszary nie są w tym czasie aktywne. Godziny dotyczą osób o pośrednim chronotypie. U „skowronków” procesy te zachodzą wcześniej, u „sów” później</w:t>
       </w:r>
     </w:p>
     <w:p>
       <w:pPr>
+        <w:rPr>
+          <w:rFonts w:ascii="Lato" w:eastAsia="Lato" w:hAnsi="Lato" w:cs="Lato"/>
+          <w:i/>
+          <w:iCs/>
+          <w:sz w:val="22"/>
+          <w:szCs w:val="22"/>
+        </w:rPr>
+      </w:pPr>
+    </w:p>
+    <w:p>
+      <w:pPr>
+        <w:rPr>
+          <w:b/>
+          <w:bCs/>
+        </w:rPr>
+      </w:pPr>
+      <w:r>
+        <w:rPr>
+          <w:b/>
+          <w:bCs/>
+        </w:rPr>
+        <w:t xml:space="preserve">1. Rano i przedpołudnie (godz. 6:00 – 12:00) </w:t>
+      </w:r>
+    </w:p>
+    <w:p>
+      <w:pPr>
         <w:numPr>
           <w:ilvl w:val="0"/>
-          <w:numId w:val="1"/>
+          <w:numId w:val="4"/>
         </w:numPr>
-      </w:pPr>
-      <w:r>
         <w:rPr>
           <w:b/>
           <w:bCs/>
         </w:rPr>
-        <w:t xml:space="preserve">Jądro </w:t>
-      </w:r>
-      <w:proofErr w:type="spellStart"/>
+      </w:pPr>
       <w:r>
         <w:rPr>
           <w:b/>
           <w:bCs/>
         </w:rPr>
-        <w:t>nadskrzyżowaniowe</w:t>
-      </w:r>
-      <w:proofErr w:type="spellEnd"/>
-      <w:r>
-        <w:rPr>
-          <w:b/>
-          <w:bCs/>
-        </w:rPr>
-        <w:t xml:space="preserve"> </w:t>
+        <w:t xml:space="preserve">Jądro nadskrzyżowaniowe </w:t>
       </w:r>
     </w:p>
     <w:p>
       <w:pPr>
         <w:ind w:left="720"/>
-      </w:pPr>
-      <w:r>
-        <w:t>Główny biologiczny zegar organizmu zlokalizowany w podwzgórzu. Rano, pod wpływem światła docierającego do siatkówki oka, SCN wykazuje najwyższą częstotliwość wyładowań elektrycznych. Hamuje wydzielanie melatoniny i wysyła sygnał do pobudzenia układu współczulnego.</w:t>
-      </w:r>
-      <w:r>
-        <w:t xml:space="preserve"> </w:t>
-      </w:r>
-      <w:r>
-        <w:t xml:space="preserve">U większości osób najwyższa wydajność funkcji wykonawczych i analitycznych przypada na późny ranek, jednak godziny szczytu różnią się w zależności od </w:t>
-      </w:r>
-      <w:proofErr w:type="spellStart"/>
-      <w:r>
-        <w:t>chronotypu</w:t>
-      </w:r>
-      <w:proofErr w:type="spellEnd"/>
-      <w:r>
-        <w:t>.</w:t>
+        <w:rPr>
+          <w:rFonts w:ascii="Aptos" w:eastAsia="Aptos" w:hAnsi="Aptos" w:cs="Aptos"/>
+        </w:rPr>
+      </w:pPr>
+      <w:r>
+        <w:t xml:space="preserve">Główny biologiczny zegar organizmu zlokalizowany w podwzgórzu. </w:t>
+      </w:r>
+      <w:r>
+        <w:rPr>
+          <w:rFonts w:ascii="Segoe UI" w:eastAsia="Segoe UI" w:hAnsi="Segoe UI" w:cs="Segoe UI"/>
+          <w:color w:val="242424"/>
+          <w:sz w:val="21"/>
+          <w:szCs w:val="21"/>
+        </w:rPr>
+        <w:t>Jego neurony są najaktywniejsze w ciągu dnia. Poranne światło docierające przez siatkówkę każdego dnia nastawia ten zegar, hamuje wydzielanie melatoniny i przygotowuje organizm do aktywności.</w:t>
       </w:r>
     </w:p>
     <w:p>
@@ -79,7 +122,7 @@
       <w:pPr>
         <w:numPr>
           <w:ilvl w:val="0"/>
-          <w:numId w:val="1"/>
+          <w:numId w:val="4"/>
         </w:numPr>
         <w:rPr>
           <w:color w:val="000000" w:themeColor="text1"/>
@@ -96,48 +139,19 @@
     </w:p>
     <w:p>
       <w:pPr>
-        <w:ind w:left="720"/>
-        <w:rPr>
-          <w:color w:val="000000" w:themeColor="text1"/>
-        </w:rPr>
-      </w:pPr>
-      <w:r>
-        <w:rPr>
-          <w:color w:val="000000" w:themeColor="text1"/>
-        </w:rPr>
-        <w:t xml:space="preserve">Odpowiada za myślenie analityczne, planowanie, pamięć roboczą i podejmowanie decyzji. Zgodnie z badaniami </w:t>
-      </w:r>
-      <w:proofErr w:type="spellStart"/>
-      <w:r>
-        <w:rPr>
-          <w:color w:val="000000" w:themeColor="text1"/>
-        </w:rPr>
-        <w:t>neuroobrazowaniowymi</w:t>
-      </w:r>
-      <w:proofErr w:type="spellEnd"/>
-      <w:r>
-        <w:rPr>
-          <w:color w:val="000000" w:themeColor="text1"/>
-        </w:rPr>
-        <w:t xml:space="preserve"> </w:t>
-      </w:r>
-      <w:r>
-        <w:rPr>
-          <w:color w:val="000000" w:themeColor="text1"/>
-        </w:rPr>
-        <w:t xml:space="preserve">u większości osób </w:t>
-      </w:r>
-      <w:r>
-        <w:rPr>
-          <w:color w:val="000000" w:themeColor="text1"/>
-        </w:rPr>
-        <w:t>jej metabolizm i wydajność osiągają szczyt w ciągu pierwszych kilku godzin po pełnym rozbudzeniu</w:t>
-      </w:r>
-      <w:r>
-        <w:rPr>
-          <w:color w:val="000000" w:themeColor="text1"/>
-        </w:rPr>
-        <w:t>.</w:t>
+        <w:ind w:left="708"/>
+        <w:rPr>
+          <w:rFonts w:ascii="Aptos" w:eastAsia="Aptos" w:hAnsi="Aptos" w:cs="Aptos"/>
+        </w:rPr>
+      </w:pPr>
+      <w:r>
+        <w:rPr>
+          <w:rFonts w:ascii="Segoe UI" w:eastAsia="Segoe UI" w:hAnsi="Segoe UI" w:cs="Segoe UI"/>
+          <w:color w:val="242424"/>
+          <w:sz w:val="21"/>
+          <w:szCs w:val="21"/>
+        </w:rPr>
+        <w:t>Odpowiada za planowanie, pamięć roboczą i podejmowanie decyzji. Sprawność tych funkcji zależy od pory dnia i od tego, ile godzin minęło od przebudzenia. U osób o pośrednim chronotypie zwykle są one najwyższe przed południem, jednak u „sów” - trochę później.</w:t>
       </w:r>
     </w:p>
     <w:p/>
@@ -153,14 +167,29 @@
           <w:b/>
           <w:bCs/>
         </w:rPr>
-        <w:t xml:space="preserve">2. Wczesne popołudnie (godz. 12:00 – 15:00) </w:t>
+        <w:t xml:space="preserve">2. Wczesne popołudnie (godz. 12:00 – </w:t>
+      </w:r>
+      <w:r>
+        <w:rPr>
+          <w:b/>
+          <w:bCs/>
+          <w:highlight w:val="yellow"/>
+        </w:rPr>
+        <w:t>16:00</w:t>
+      </w:r>
+      <w:r>
+        <w:rPr>
+          <w:b/>
+          <w:bCs/>
+        </w:rPr>
+        <w:t xml:space="preserve">) </w:t>
       </w:r>
     </w:p>
     <w:p>
       <w:pPr>
         <w:numPr>
           <w:ilvl w:val="0"/>
-          <w:numId w:val="3"/>
+          <w:numId w:val="6"/>
         </w:numPr>
         <w:rPr>
           <w:color w:val="000000" w:themeColor="text1"/>
@@ -179,146 +208,25 @@
       <w:pPr>
         <w:ind w:left="720"/>
         <w:rPr>
-          <w:color w:val="000000" w:themeColor="text1"/>
-        </w:rPr>
-      </w:pPr>
-      <w:r>
-        <w:rPr>
-          <w:color w:val="000000" w:themeColor="text1"/>
-        </w:rPr>
-        <w:t>W tych godzinach naturalnie spada czujność i skupienie na trudnych zadaniach</w:t>
-      </w:r>
-      <w:r>
-        <w:rPr>
-          <w:color w:val="000000" w:themeColor="text1"/>
-        </w:rPr>
-        <w:t xml:space="preserve">, </w:t>
-      </w:r>
-      <w:r>
-        <w:rPr>
-          <w:color w:val="000000" w:themeColor="text1"/>
-        </w:rPr>
-        <w:t xml:space="preserve">ale wzrasta podatność na poszukiwanie nagrody i interakcje społeczne. Badania pokazują, że </w:t>
-      </w:r>
-      <w:r>
-        <w:rPr>
-          <w:color w:val="000000" w:themeColor="text1"/>
-        </w:rPr>
-        <w:t>r</w:t>
-      </w:r>
-      <w:r>
-        <w:rPr>
-          <w:color w:val="000000" w:themeColor="text1"/>
-        </w:rPr>
-        <w:t>eaktywność jądra półleżącego na bodźce nagradzające wykazuje rytmikę dobową ze specyficznymi wahaniami w godzinach popołudniowych i wieczornych</w:t>
-      </w:r>
-      <w:r>
-        <w:rPr>
-          <w:color w:val="000000" w:themeColor="text1"/>
-        </w:rPr>
-        <w:t>, stąd w tych godzinach mamy</w:t>
-      </w:r>
-      <w:r>
-        <w:rPr>
-          <w:rFonts w:ascii="Segoe UI" w:eastAsia="Times New Roman" w:hAnsi="Segoe UI" w:cs="Segoe UI"/>
-          <w:color w:val="000000" w:themeColor="text1"/>
-          <w:kern w:val="0"/>
+          <w:rFonts w:ascii="Aptos" w:eastAsia="Aptos" w:hAnsi="Aptos" w:cs="Aptos"/>
+        </w:rPr>
+      </w:pPr>
+      <w:r>
+        <w:rPr>
+          <w:rFonts w:ascii="Segoe UI" w:eastAsia="Segoe UI" w:hAnsi="Segoe UI" w:cs="Segoe UI"/>
           <w:sz w:val="21"/>
           <w:szCs w:val="21"/>
-          <w:lang w:eastAsia="pl-PL"/>
-          <w14:ligatures w14:val="none"/>
-        </w:rPr>
-        <w:t xml:space="preserve"> </w:t>
-      </w:r>
-      <w:r>
-        <w:rPr>
-          <w:rFonts w:eastAsia="Times New Roman" w:cs="Segoe UI"/>
-          <w:color w:val="000000" w:themeColor="text1"/>
-          <w:kern w:val="0"/>
-          <w:lang w:eastAsia="pl-PL"/>
-          <w14:ligatures w14:val="none"/>
-        </w:rPr>
-        <w:t>w</w:t>
-      </w:r>
-      <w:r>
-        <w:rPr>
-          <w:rFonts w:eastAsia="Times New Roman" w:cs="Segoe UI"/>
-          <w:color w:val="000000" w:themeColor="text1"/>
-          <w:kern w:val="0"/>
-          <w:lang w:eastAsia="pl-PL"/>
-          <w14:ligatures w14:val="none"/>
-        </w:rPr>
-        <w:t>iększ</w:t>
-      </w:r>
-      <w:r>
-        <w:rPr>
-          <w:rFonts w:eastAsia="Times New Roman" w:cs="Segoe UI"/>
-          <w:color w:val="000000" w:themeColor="text1"/>
-          <w:kern w:val="0"/>
-          <w:lang w:eastAsia="pl-PL"/>
-          <w14:ligatures w14:val="none"/>
-        </w:rPr>
-        <w:t>ą</w:t>
-      </w:r>
-      <w:r>
-        <w:rPr>
-          <w:rFonts w:eastAsia="Times New Roman" w:cs="Segoe UI"/>
-          <w:color w:val="000000" w:themeColor="text1"/>
-          <w:kern w:val="0"/>
-          <w:lang w:eastAsia="pl-PL"/>
-          <w14:ligatures w14:val="none"/>
-        </w:rPr>
-        <w:t xml:space="preserve"> motywacj</w:t>
-      </w:r>
-      <w:r>
-        <w:rPr>
-          <w:rFonts w:eastAsia="Times New Roman" w:cs="Segoe UI"/>
-          <w:color w:val="000000" w:themeColor="text1"/>
-          <w:kern w:val="0"/>
-          <w:lang w:eastAsia="pl-PL"/>
-          <w14:ligatures w14:val="none"/>
-        </w:rPr>
-        <w:t>e</w:t>
-      </w:r>
-      <w:r>
-        <w:rPr>
-          <w:rFonts w:eastAsia="Times New Roman" w:cs="Segoe UI"/>
-          <w:color w:val="000000" w:themeColor="text1"/>
-          <w:kern w:val="0"/>
-          <w:lang w:eastAsia="pl-PL"/>
-          <w14:ligatures w14:val="none"/>
-        </w:rPr>
-        <w:t xml:space="preserve"> do kontaktów społecznych i</w:t>
-      </w:r>
-      <w:r>
-        <w:rPr>
-          <w:rFonts w:eastAsia="Times New Roman" w:cs="Segoe UI"/>
-          <w:color w:val="000000" w:themeColor="text1"/>
-          <w:kern w:val="0"/>
-          <w:lang w:eastAsia="pl-PL"/>
-          <w14:ligatures w14:val="none"/>
-        </w:rPr>
-        <w:t xml:space="preserve"> szukania</w:t>
-      </w:r>
-      <w:r>
-        <w:rPr>
-          <w:rFonts w:eastAsia="Times New Roman" w:cs="Segoe UI"/>
-          <w:color w:val="000000" w:themeColor="text1"/>
-          <w:kern w:val="0"/>
-          <w:lang w:eastAsia="pl-PL"/>
-          <w14:ligatures w14:val="none"/>
-        </w:rPr>
-        <w:t xml:space="preserve"> przyjemnoś</w:t>
-      </w:r>
-      <w:r>
-        <w:rPr>
-          <w:rFonts w:eastAsia="Times New Roman" w:cs="Segoe UI"/>
-          <w:color w:val="000000" w:themeColor="text1"/>
-          <w:kern w:val="0"/>
-          <w:lang w:eastAsia="pl-PL"/>
-          <w14:ligatures w14:val="none"/>
-        </w:rPr>
-        <w:t>ci.</w:t>
+        </w:rPr>
+        <w:t>ten zbiór struktur mózgowych odpowiedzialnych za motywację, uczenie się zachowań ukierunkowanych na cel oraz odczuwanie przyjemności</w:t>
+      </w:r>
+      <w:r>
+        <w:rPr>
+          <w:rFonts w:ascii="Segoe UI" w:eastAsia="Segoe UI" w:hAnsi="Segoe UI" w:cs="Segoe UI"/>
+          <w:color w:val="242424"/>
+          <w:sz w:val="21"/>
+          <w:szCs w:val="21"/>
+        </w:rPr>
+        <w:t xml:space="preserve"> ma również rytm dobowy. Deklarowane samopoczucie pozytywne (dobry nastrój, energia) zwykle osiąga szczyt po południu. Paradoksalnie jednak w badaniu z użyciem rezonansu magnetycznego na 16 młodych mężczyznach mózg reagował na nagrodę najsłabiej około 14:00, a silniej rano i wieczorem. Badacze tłumaczą, że mózg mocniej reaguje na przyjemności, których się nie spodziewa.</w:t>
       </w:r>
     </w:p>
     <w:p>
@@ -332,7 +240,7 @@
       <w:pPr>
         <w:numPr>
           <w:ilvl w:val="0"/>
-          <w:numId w:val="3"/>
+          <w:numId w:val="6"/>
         </w:numPr>
         <w:rPr>
           <w:color w:val="000000" w:themeColor="text1"/>
@@ -344,7 +252,7 @@
           <w:bCs/>
           <w:color w:val="000000" w:themeColor="text1"/>
         </w:rPr>
-        <w:t>Spadek aktywności w korze przedczołowej:</w:t>
+        <w:t>Kora przedczołowa:</w:t>
       </w:r>
       <w:r>
         <w:rPr>
@@ -356,33 +264,15 @@
     <w:p>
       <w:pPr>
         <w:ind w:left="720"/>
-        <w:rPr>
-          <w:color w:val="000000" w:themeColor="text1"/>
-        </w:rPr>
-      </w:pPr>
-      <w:r>
-        <w:rPr>
-          <w:color w:val="000000" w:themeColor="text1"/>
-        </w:rPr>
-        <w:t>Wzrost ciśnienia sennego nakłada się na dobowy spadek temperatury ciała, co prowadzi do chwilowego obniżenia metabolizmu w obszarach asocjacyjnych kory mózgowej.</w:t>
-      </w:r>
-      <w:r>
-        <w:rPr>
-          <w:color w:val="000000" w:themeColor="text1"/>
-        </w:rPr>
-        <w:t xml:space="preserve"> Następuję naturalny spadek czujności</w:t>
-      </w:r>
-      <w:r>
-        <w:rPr>
-          <w:color w:val="000000" w:themeColor="text1"/>
-        </w:rPr>
-        <w:t xml:space="preserve"> i funkcji poznawczych</w:t>
-      </w:r>
-      <w:r>
-        <w:rPr>
-          <w:color w:val="000000" w:themeColor="text1"/>
-        </w:rPr>
-        <w:t xml:space="preserve"> związanego z rytmem dobowym i presja snu.</w:t>
+      </w:pPr>
+      <w:r>
+        <w:rPr>
+          <w:rFonts w:ascii="Segoe UI" w:eastAsia="Segoe UI" w:hAnsi="Segoe UI" w:cs="Segoe UI"/>
+          <w:color w:val="242424"/>
+          <w:sz w:val="21"/>
+          <w:szCs w:val="21"/>
+        </w:rPr>
+        <w:t>W tej części mózgu obserwujemy spadek aktywności. Może objawiać się to przejściowym spadkiem czujności i zdolności skupienia. Dołek ma źródło w rytmie dobowym. Może wystąpić także bez obiadu, nawet gdy ktoś nie wie, która jest godzina, ale posiłek bogaty w węglowodany go nasila</w:t>
       </w:r>
     </w:p>
     <w:p>
@@ -419,7 +309,7 @@
       <w:pPr>
         <w:numPr>
           <w:ilvl w:val="0"/>
-          <w:numId w:val="5"/>
+          <w:numId w:val="8"/>
         </w:numPr>
         <w:rPr>
           <w:color w:val="000000" w:themeColor="text1"/>
@@ -438,52 +328,32 @@
       <w:pPr>
         <w:ind w:left="720"/>
         <w:rPr>
-          <w:color w:val="000000" w:themeColor="text1"/>
-        </w:rPr>
-      </w:pPr>
-      <w:r>
-        <w:rPr>
-          <w:color w:val="000000" w:themeColor="text1"/>
-        </w:rPr>
-        <w:lastRenderedPageBreak/>
-        <w:t>O</w:t>
-      </w:r>
-      <w:r>
-        <w:rPr>
-          <w:color w:val="000000" w:themeColor="text1"/>
-        </w:rPr>
-        <w:t>rganizm osiąga najwyższą temperaturę ciała, a kora ruchowa wykazuje najwyższą pobudliwość</w:t>
-      </w:r>
-      <w:r>
-        <w:rPr>
-          <w:color w:val="000000" w:themeColor="text1"/>
-        </w:rPr>
-        <w:t xml:space="preserve">, </w:t>
-      </w:r>
-      <w:r>
-        <w:rPr>
-          <w:color w:val="000000" w:themeColor="text1"/>
-        </w:rPr>
-        <w:t>co w badaniach nad TMS – przezczaszkową stymulacją magnetyczną – przekłada się na najkrótszy czas reakcji i najlepszą koordynację</w:t>
-      </w:r>
-      <w:r>
-        <w:rPr>
-          <w:color w:val="000000" w:themeColor="text1"/>
-        </w:rPr>
-        <w:t xml:space="preserve"> fizyczną</w:t>
-      </w:r>
-      <w:r>
-        <w:rPr>
-          <w:color w:val="000000" w:themeColor="text1"/>
-        </w:rPr>
-        <w:t>.</w:t>
+          <w:rFonts w:ascii="Aptos" w:eastAsia="Aptos" w:hAnsi="Aptos" w:cs="Aptos"/>
+        </w:rPr>
+      </w:pPr>
+      <w:r>
+        <w:rPr>
+          <w:rFonts w:ascii="Segoe UI" w:eastAsia="Segoe UI" w:hAnsi="Segoe UI" w:cs="Segoe UI"/>
+          <w:sz w:val="21"/>
+          <w:szCs w:val="21"/>
+        </w:rPr>
+        <w:t xml:space="preserve">Odpowiada za planowanie, kontrolę oraz realizację świadomych ruchów mięśni szkieletowych. </w:t>
+      </w:r>
+      <w:r>
+        <w:rPr>
+          <w:rFonts w:ascii="Segoe UI" w:eastAsia="Segoe UI" w:hAnsi="Segoe UI" w:cs="Segoe UI"/>
+          <w:color w:val="242424"/>
+          <w:sz w:val="21"/>
+          <w:szCs w:val="21"/>
+        </w:rPr>
+        <w:t>U wielu osób późne popołudnie to pora najkrótszego czasu reakcji i najlepszej koordynacji. U poddanych badaniu sportowców szczyt formy zależał jednak bardziej od tego, ile godzin minęło od przebudzenia niż od godziny na zegarze, a różnice w ciągu dnia sięgały 26%.</w:t>
       </w:r>
     </w:p>
     <w:p>
       <w:pPr>
         <w:numPr>
           <w:ilvl w:val="0"/>
-          <w:numId w:val="5"/>
+          <w:numId w:val="8"/>
         </w:numPr>
         <w:rPr>
           <w:color w:val="000000" w:themeColor="text1"/>
@@ -497,7 +367,6 @@
         </w:rPr>
         <w:t>Sieć DMN (</w:t>
       </w:r>
-      <w:proofErr w:type="spellStart"/>
       <w:r>
         <w:rPr>
           <w:b/>
@@ -506,40 +375,7 @@
           <w:iCs/>
           <w:color w:val="000000" w:themeColor="text1"/>
         </w:rPr>
-        <w:t>Default</w:t>
-      </w:r>
-      <w:proofErr w:type="spellEnd"/>
-      <w:r>
-        <w:rPr>
-          <w:b/>
-          <w:bCs/>
-          <w:i/>
-          <w:iCs/>
-          <w:color w:val="000000" w:themeColor="text1"/>
-        </w:rPr>
-        <w:t xml:space="preserve"> </w:t>
-      </w:r>
-      <w:proofErr w:type="spellStart"/>
-      <w:r>
-        <w:rPr>
-          <w:b/>
-          <w:bCs/>
-          <w:i/>
-          <w:iCs/>
-          <w:color w:val="000000" w:themeColor="text1"/>
-        </w:rPr>
-        <w:t>Mode</w:t>
-      </w:r>
-      <w:proofErr w:type="spellEnd"/>
-      <w:r>
-        <w:rPr>
-          <w:b/>
-          <w:bCs/>
-          <w:i/>
-          <w:iCs/>
-          <w:color w:val="000000" w:themeColor="text1"/>
-        </w:rPr>
-        <w:t xml:space="preserve"> Network</w:t>
+        <w:t>Default Mode Network</w:t>
       </w:r>
       <w:r>
         <w:rPr>
@@ -559,79 +395,32 @@
       </w:pPr>
       <w:r>
         <w:rPr>
-          <w:color w:val="000000" w:themeColor="text1"/>
-        </w:rPr>
-        <w:t xml:space="preserve">Pod koniec dnia, gdy spada ścisła kontrola </w:t>
-      </w:r>
-      <w:proofErr w:type="spellStart"/>
-      <w:r>
-        <w:rPr>
-          <w:color w:val="000000" w:themeColor="text1"/>
-        </w:rPr>
-        <w:t>egzekutywna</w:t>
-      </w:r>
-      <w:proofErr w:type="spellEnd"/>
-      <w:r>
-        <w:rPr>
-          <w:color w:val="000000" w:themeColor="text1"/>
-        </w:rPr>
-        <w:t xml:space="preserve"> kory przedczołowej, częściej aktywuje się sieć spoczynkowa (DMN). </w:t>
-      </w:r>
-      <w:r>
-        <w:rPr>
-          <w:color w:val="000000" w:themeColor="text1"/>
-        </w:rPr>
-        <w:t>U części osób może s</w:t>
-      </w:r>
-      <w:r>
-        <w:rPr>
-          <w:color w:val="000000" w:themeColor="text1"/>
-        </w:rPr>
-        <w:t>przyja</w:t>
-      </w:r>
-      <w:r>
-        <w:rPr>
-          <w:color w:val="000000" w:themeColor="text1"/>
-        </w:rPr>
-        <w:t>ć</w:t>
-      </w:r>
-      <w:r>
-        <w:rPr>
-          <w:color w:val="000000" w:themeColor="text1"/>
-        </w:rPr>
-        <w:t xml:space="preserve"> to myśleniu nieprzetartymi szlakami, łączeniu odległych faktów i kreatywności.</w:t>
-      </w:r>
-      <w:r>
-        <w:rPr>
-          <w:color w:val="000000" w:themeColor="text1"/>
-        </w:rPr>
-        <w:t xml:space="preserve"> </w:t>
+          <w:rFonts w:ascii="Segoe UI" w:eastAsia="Segoe UI" w:hAnsi="Segoe UI" w:cs="Segoe UI"/>
+          <w:sz w:val="21"/>
+          <w:szCs w:val="21"/>
+        </w:rPr>
+        <w:t xml:space="preserve">to zintegrowana sieć obszarów mózgu, która wykazuje najwyższą aktywność, gdy organizm nie jest zaangażowany w wykonywanie konkretnego zadania nastawionego na świat zewnętrzny. </w:t>
+      </w:r>
+      <w:r>
+        <w:rPr>
+          <w:rFonts w:ascii="Segoe UI" w:eastAsia="Segoe UI" w:hAnsi="Segoe UI" w:cs="Segoe UI"/>
+          <w:color w:val="242424"/>
+          <w:sz w:val="21"/>
+          <w:szCs w:val="21"/>
+        </w:rPr>
+        <w:t>Wtedy zaczynamy błądzić myślami, wykazujemy skłonność do głębszych refleksji. Badania pokazują, w porze dla nas nieoptymalnej (dla „skowronka” wieczorem, ale dla "sowy" wczesny poranek) łatwiej o nieoczywiste skojarzenia. Jednak odpowiedzialność sieci DMN za naszą kreatywność to na razie hipoteza.</w:t>
       </w:r>
     </w:p>
     <w:p>
       <w:pPr>
-        <w:rPr>
+        <w:spacing w:line="257" w:lineRule="auto"/>
+        <w:rPr>
+          <w:rFonts w:ascii="Lato" w:eastAsia="Lato" w:hAnsi="Lato" w:cs="Lato"/>
           <w:b/>
           <w:bCs/>
-        </w:rPr>
-      </w:pPr>
-      <w:r>
-        <w:rPr>
-          <w:b/>
-          <w:bCs/>
-        </w:rPr>
-        <w:t xml:space="preserve">4. Noc i sen (godz. 23:00 – 6:00) </w:t>
-      </w:r>
-    </w:p>
-    <w:p>
-      <w:pPr>
-        <w:pStyle w:val="Akapitzlist"/>
-        <w:numPr>
-          <w:ilvl w:val="0"/>
-          <w:numId w:val="9"/>
-        </w:numPr>
-        <w:rPr>
-          <w:color w:val="000000" w:themeColor="text1"/>
+          <w:sz w:val="20"/>
+          <w:szCs w:val="20"/>
+          <w:highlight w:val="yellow"/>
         </w:rPr>
       </w:pPr>
       <w:r>
@@ -639,212 +428,260 @@
           <w:b/>
           <w:bCs/>
           <w:color w:val="000000" w:themeColor="text1"/>
-        </w:rPr>
-        <w:t>Hipokamp (</w:t>
-      </w:r>
-      <w:proofErr w:type="spellStart"/>
+          <w:highlight w:val="yellow"/>
+        </w:rPr>
+        <w:t xml:space="preserve">4. Wieczór </w:t>
+      </w:r>
+      <w:r>
+        <w:rPr>
+          <w:rFonts w:ascii="Lato" w:eastAsia="Lato" w:hAnsi="Lato" w:cs="Lato"/>
+          <w:b/>
+          <w:bCs/>
+          <w:sz w:val="20"/>
+          <w:szCs w:val="20"/>
+          <w:highlight w:val="yellow"/>
+        </w:rPr>
+        <w:t>20:00–23:00</w:t>
+      </w:r>
+    </w:p>
+    <w:p>
+      <w:pPr>
+        <w:pStyle w:val="ListParagraph"/>
+        <w:numPr>
+          <w:ilvl w:val="0"/>
+          <w:numId w:val="1"/>
+        </w:numPr>
+        <w:spacing w:line="257" w:lineRule="auto"/>
+        <w:rPr>
+          <w:rFonts w:ascii="Lato" w:eastAsia="Lato" w:hAnsi="Lato" w:cs="Lato"/>
+          <w:b/>
+          <w:bCs/>
+          <w:sz w:val="20"/>
+          <w:szCs w:val="20"/>
+        </w:rPr>
+      </w:pPr>
+      <w:r>
+        <w:rPr>
+          <w:rFonts w:ascii="Lato" w:eastAsia="Lato" w:hAnsi="Lato" w:cs="Lato"/>
+          <w:b/>
+          <w:bCs/>
+          <w:sz w:val="20"/>
+          <w:szCs w:val="20"/>
+        </w:rPr>
+        <w:t>Szyszynka</w:t>
+      </w:r>
+    </w:p>
+    <w:p>
+      <w:pPr>
+        <w:spacing w:line="257" w:lineRule="auto"/>
+        <w:rPr>
+          <w:rFonts w:ascii="Segoe UI" w:eastAsia="Segoe UI" w:hAnsi="Segoe UI" w:cs="Segoe UI"/>
+          <w:sz w:val="20"/>
+          <w:szCs w:val="20"/>
+        </w:rPr>
+      </w:pPr>
+      <w:r>
+        <w:rPr>
+          <w:rFonts w:ascii="Segoe UI" w:eastAsia="Segoe UI" w:hAnsi="Segoe UI" w:cs="Segoe UI"/>
+          <w:sz w:val="20"/>
+          <w:szCs w:val="20"/>
+        </w:rPr>
+        <w:t>pełni kluczową rolę w synchronizacji organizmu z cyklem światła i ciemności. Na sygnał zegara biologicznego zaczyna wydzielać melatoninę, hormon „biologicznej nocy”. W przyciemnionym świetle dzieje się to średnio około dwóch godzin przed zwykłą porą snu. Już zwykłe oświetlenie pokojowe wieczorem może opóźniać i skracać wydzielanie melatoniny. Wielogodzinne korzystanie z jasnych ekranów krótko przed snem działa podobnie.</w:t>
+      </w:r>
+    </w:p>
+    <w:p>
+      <w:pPr>
+        <w:pStyle w:val="ListParagraph"/>
+        <w:spacing w:line="257" w:lineRule="auto"/>
+        <w:rPr>
+          <w:rFonts w:ascii="Lato" w:eastAsia="Lato" w:hAnsi="Lato" w:cs="Lato"/>
+          <w:b/>
+          <w:bCs/>
+          <w:sz w:val="20"/>
+          <w:szCs w:val="20"/>
+        </w:rPr>
+      </w:pPr>
+    </w:p>
+    <w:p>
+      <w:pPr>
+        <w:pStyle w:val="ListParagraph"/>
+        <w:spacing w:line="257" w:lineRule="auto"/>
+        <w:rPr>
+          <w:rFonts w:ascii="Lato" w:eastAsia="Lato" w:hAnsi="Lato" w:cs="Lato"/>
+          <w:b/>
+          <w:bCs/>
+          <w:sz w:val="20"/>
+          <w:szCs w:val="20"/>
+        </w:rPr>
+      </w:pPr>
+    </w:p>
+    <w:p>
+      <w:pPr>
+        <w:rPr>
+          <w:b/>
+          <w:bCs/>
+        </w:rPr>
+      </w:pPr>
+      <w:r>
+        <w:rPr>
+          <w:b/>
+          <w:bCs/>
+          <w:highlight w:val="yellow"/>
+        </w:rPr>
+        <w:t>5.</w:t>
+      </w:r>
+      <w:r>
+        <w:rPr>
+          <w:b/>
+          <w:bCs/>
+        </w:rPr>
+        <w:t xml:space="preserve"> Noc i sen (godz. 23:00 – 6:00) </w:t>
+      </w:r>
+    </w:p>
+    <w:p>
+      <w:pPr>
+        <w:pStyle w:val="ListParagraph"/>
+        <w:numPr>
+          <w:ilvl w:val="0"/>
+          <w:numId w:val="12"/>
+        </w:numPr>
+        <w:rPr>
+          <w:color w:val="000000" w:themeColor="text1"/>
+        </w:rPr>
+      </w:pPr>
       <w:r>
         <w:rPr>
           <w:b/>
           <w:bCs/>
           <w:color w:val="000000" w:themeColor="text1"/>
         </w:rPr>
-        <w:t>Hippocampus</w:t>
-      </w:r>
-      <w:proofErr w:type="spellEnd"/>
-      <w:r>
+        <w:t xml:space="preserve">Hipokamp (Hippocampus) i Kora Nowa (Neocortex) </w:t>
+      </w:r>
+    </w:p>
+    <w:p>
+      <w:pPr>
+        <w:ind w:left="720"/>
+        <w:rPr>
+          <w:rFonts w:ascii="Aptos" w:eastAsia="Aptos" w:hAnsi="Aptos" w:cs="Aptos"/>
+        </w:rPr>
+      </w:pPr>
+      <w:r>
+        <w:rPr>
+          <w:rFonts w:ascii="Segoe UI" w:eastAsia="Segoe UI" w:hAnsi="Segoe UI" w:cs="Segoe UI"/>
+          <w:color w:val="242424"/>
+          <w:sz w:val="21"/>
+          <w:szCs w:val="21"/>
+        </w:rPr>
+        <w:t>w głębokim śnie NREM, głównie w pierwszej połowie nocy, hipokamp „odtwarza” ślady pamięciowe z minionego dnia. Dzięki zsynchronizowanym falom mózgowym są one wzmacniane i stopniowo utrwalane w korze nowej. To tzw. konsolidacja pamięci.</w:t>
+      </w:r>
+    </w:p>
+    <w:p>
+      <w:pPr>
+        <w:numPr>
+          <w:ilvl w:val="0"/>
+          <w:numId w:val="10"/>
+        </w:numPr>
         <w:rPr>
           <w:b/>
           <w:bCs/>
           <w:color w:val="000000" w:themeColor="text1"/>
         </w:rPr>
-        <w:t>) i Kora Nowa (</w:t>
-      </w:r>
-      <w:proofErr w:type="spellStart"/>
+      </w:pPr>
       <w:r>
         <w:rPr>
           <w:b/>
           <w:bCs/>
           <w:color w:val="000000" w:themeColor="text1"/>
         </w:rPr>
-        <w:t>Neocortex</w:t>
-      </w:r>
-      <w:proofErr w:type="spellEnd"/>
+        <w:t xml:space="preserve">Ciało migdałowate i Kora wzrokowa </w:t>
+      </w:r>
+    </w:p>
+    <w:p>
+      <w:pPr>
+        <w:ind w:left="720"/>
+        <w:rPr>
+          <w:rFonts w:ascii="Aptos" w:eastAsia="Aptos" w:hAnsi="Aptos" w:cs="Aptos"/>
+        </w:rPr>
+      </w:pPr>
+      <w:r>
+        <w:rPr>
+          <w:color w:val="000000" w:themeColor="text1"/>
+        </w:rPr>
+        <w:t>Podczas fazy REM aktywność ciała migdałowatego oraz kory wzrokowej jest bardzo wysoka, stąd wyraziste sny. Aktywność grzbietowo-bocznej kory przedczołowej natomiast jest wyraźnie obniżona, co może tłumaczyć ograniczoną kontrolę logiczną i krytyczną ocenę wydarzeń sennych. S</w:t>
+      </w:r>
+      <w:r>
+        <w:rPr>
+          <w:rFonts w:ascii="Segoe UI" w:eastAsia="Segoe UI" w:hAnsi="Segoe UI" w:cs="Segoe UI"/>
+          <w:color w:val="242424"/>
+          <w:sz w:val="21"/>
+          <w:szCs w:val="21"/>
+        </w:rPr>
+        <w:t>en REM przeważa w drugiej połowie nocy.</w:t>
+      </w:r>
+    </w:p>
+    <w:p>
+      <w:pPr>
+        <w:numPr>
+          <w:ilvl w:val="0"/>
+          <w:numId w:val="10"/>
+        </w:numPr>
+      </w:pPr>
       <w:r>
         <w:rPr>
           <w:b/>
           <w:bCs/>
-          <w:color w:val="000000" w:themeColor="text1"/>
-        </w:rPr>
-        <w:t xml:space="preserve">) </w:t>
+        </w:rPr>
+        <w:t xml:space="preserve">Układ </w:t>
+      </w:r>
+      <w:proofErr w:type="spellStart"/>
+      <w:r>
+        <w:rPr>
+          <w:b/>
+          <w:bCs/>
+        </w:rPr>
+        <w:t>glimfatyczny</w:t>
+      </w:r>
+      <w:proofErr w:type="spellEnd"/>
+      <w:r>
+        <w:rPr>
+          <w:b/>
+          <w:bCs/>
+        </w:rPr>
+        <w:t xml:space="preserve"> </w:t>
       </w:r>
     </w:p>
     <w:p>
       <w:pPr>
         <w:ind w:left="720"/>
         <w:rPr>
-          <w:color w:val="000000" w:themeColor="text1"/>
-        </w:rPr>
-      </w:pPr>
-      <w:r>
-        <w:rPr>
-          <w:color w:val="000000" w:themeColor="text1"/>
-        </w:rPr>
-        <w:t xml:space="preserve">W fazie </w:t>
-      </w:r>
-      <w:proofErr w:type="spellStart"/>
-      <w:r>
-        <w:rPr>
-          <w:color w:val="000000" w:themeColor="text1"/>
-        </w:rPr>
-        <w:t>wolnofalowej</w:t>
-      </w:r>
-      <w:proofErr w:type="spellEnd"/>
-      <w:r>
-        <w:rPr>
-          <w:color w:val="000000" w:themeColor="text1"/>
-        </w:rPr>
-        <w:t xml:space="preserve"> (NREM) hipokamp "odgrywa"</w:t>
-      </w:r>
-      <w:r>
-        <w:rPr>
-          <w:color w:val="000000" w:themeColor="text1"/>
-        </w:rPr>
-        <w:t xml:space="preserve"> </w:t>
-      </w:r>
-      <w:r>
-        <w:rPr>
-          <w:color w:val="000000" w:themeColor="text1"/>
-        </w:rPr>
-        <w:t>ślady pamięciowe z minionego dnia i przesyła je do kory nowej w celu trwałego zapamiętania</w:t>
-      </w:r>
-      <w:r>
-        <w:rPr>
-          <w:color w:val="000000" w:themeColor="text1"/>
-        </w:rPr>
-        <w:t>. Następuje t</w:t>
-      </w:r>
-      <w:r>
-        <w:rPr>
-          <w:color w:val="000000" w:themeColor="text1"/>
-        </w:rPr>
-        <w:t xml:space="preserve">zw. konsolidacja pamięci. </w:t>
+          <w:rFonts w:ascii="Aptos" w:eastAsia="Aptos" w:hAnsi="Aptos" w:cs="Aptos"/>
+        </w:rPr>
+      </w:pPr>
+      <w:r>
+        <w:rPr>
+          <w:rFonts w:ascii="Segoe UI" w:eastAsia="Segoe UI" w:hAnsi="Segoe UI" w:cs="Segoe UI"/>
+          <w:color w:val="242424"/>
+          <w:sz w:val="21"/>
+          <w:szCs w:val="21"/>
+        </w:rPr>
+        <w:lastRenderedPageBreak/>
+        <w:t>sieć przestrzeni wokół naczyń krwionośnych, którymi płyn mózgowo-rdzeniowy przepływa przez tkankę mózgu. Badania sugerują, że w głębokim śnie rośnie przepływ tego płynu, co może sprzyjać usuwaniu produktów przemiany materii. Mechanizm wciąż jest przedmiotem dyskusji naukowej.</w:t>
       </w:r>
     </w:p>
     <w:p>
       <w:pPr>
-        <w:numPr>
-          <w:ilvl w:val="0"/>
-          <w:numId w:val="7"/>
-        </w:numPr>
-        <w:rPr>
-          <w:b/>
-          <w:bCs/>
-          <w:color w:val="000000" w:themeColor="text1"/>
-        </w:rPr>
-      </w:pPr>
-      <w:r>
-        <w:rPr>
-          <w:b/>
-          <w:bCs/>
-          <w:color w:val="000000" w:themeColor="text1"/>
-        </w:rPr>
-        <w:t xml:space="preserve">Układ </w:t>
-      </w:r>
-      <w:proofErr w:type="spellStart"/>
-      <w:r>
-        <w:rPr>
-          <w:b/>
-          <w:bCs/>
-          <w:color w:val="000000" w:themeColor="text1"/>
-        </w:rPr>
-        <w:t>limficzny</w:t>
-      </w:r>
-      <w:proofErr w:type="spellEnd"/>
-      <w:r>
-        <w:rPr>
-          <w:b/>
-          <w:bCs/>
-          <w:color w:val="000000" w:themeColor="text1"/>
-        </w:rPr>
-        <w:t xml:space="preserve"> (Ciało migdałowate) i Kora wzrokowa </w:t>
-      </w:r>
-    </w:p>
-    <w:p>
-      <w:pPr>
-        <w:ind w:left="720"/>
-        <w:rPr>
-          <w:b/>
-          <w:bCs/>
-          <w:color w:val="000000" w:themeColor="text1"/>
-        </w:rPr>
-      </w:pPr>
-      <w:r>
-        <w:rPr>
-          <w:color w:val="000000" w:themeColor="text1"/>
-        </w:rPr>
-        <w:t xml:space="preserve">Podczas fazy REM aktywność ciała migdałowatego oraz kory wzrokowej jest niemal tak wysoka jak na jawie (stąd wyraziste sny), podczas gdy </w:t>
-      </w:r>
-      <w:r>
-        <w:rPr>
-          <w:color w:val="000000" w:themeColor="text1"/>
-        </w:rPr>
-        <w:t>aktywność grzbietowo-bocznej kory przedczołowej jest wyraźnie obniżona, co może tłumaczyć ograniczoną kontrolę logiczną i krytyczną ocenę wydarzeń sennych.</w:t>
-      </w:r>
-    </w:p>
-    <w:p>
-      <w:pPr>
-        <w:numPr>
-          <w:ilvl w:val="0"/>
-          <w:numId w:val="7"/>
-        </w:numPr>
-      </w:pPr>
-      <w:r>
-        <w:rPr>
-          <w:b/>
-          <w:bCs/>
-        </w:rPr>
-        <w:t xml:space="preserve">Układ </w:t>
-      </w:r>
-      <w:proofErr w:type="spellStart"/>
-      <w:r>
-        <w:rPr>
-          <w:b/>
-          <w:bCs/>
-        </w:rPr>
-        <w:t>glimfatyczny</w:t>
-      </w:r>
-      <w:proofErr w:type="spellEnd"/>
-      <w:r>
-        <w:rPr>
-          <w:b/>
-          <w:bCs/>
-        </w:rPr>
-        <w:t xml:space="preserve"> </w:t>
-      </w:r>
-    </w:p>
-    <w:p>
-      <w:pPr>
-        <w:ind w:left="720"/>
-      </w:pPr>
-      <w:r>
-        <w:t xml:space="preserve">Badania sugerują, że podczas głębokiego snu wzrasta przepływ płynu mózgowo-rdzeniowego i aktywność układu </w:t>
-      </w:r>
-      <w:proofErr w:type="spellStart"/>
-      <w:r>
-        <w:t>glimfatycznego</w:t>
-      </w:r>
-      <w:proofErr w:type="spellEnd"/>
-      <w:r>
-        <w:t xml:space="preserve"> odpowiedzialnego za usuwanie produktów przemiany materii z mózgu. </w:t>
-      </w:r>
-    </w:p>
-    <w:p>
-      <w:pPr>
         <w:ind w:left="720"/>
       </w:pPr>
     </w:p>
     <w:p/>
+    <w:p/>
+    <w:p>
+      <w:pPr>
+        <w:rPr>
+          <w:lang w:val="en-US"/>
+        </w:rPr>
+      </w:pPr>
+    </w:p>
     <w:sectPr>
       <w:pgSz w:w="11906" w:h="16838"/>
       <w:pgMar w:top="1417" w:right="1417" w:bottom="1417" w:left="1417" w:header="708" w:footer="708" w:gutter="0"/>
@@ -856,7 +693,7 @@
 </file>
 
 <file path=word/numbering.xml><?xml version="1.0" encoding="utf-8"?>
-<w:numbering xmlns:wpc="http://schemas.microsoft.com/office/word/2010/wordprocessingCanvas" xmlns:cx="http://schemas.microsoft.com/office/drawing/2014/chartex" xmlns:cx1="http://schemas.microsoft.com/office/drawing/2015/9/8/chartex" xmlns:cx2="http://schemas.microsoft.com/office/drawing/2015/10/21/chartex" xmlns:cx3="http://schemas.microsoft.com/office/drawing/2016/5/9/chartex" xmlns:cx4="http://schemas.microsoft.com/office/drawing/2016/5/10/chartex" xmlns:cx5="http://schemas.microsoft.com/office/drawing/2016/5/11/chartex" xmlns:cx6="http://schemas.microsoft.com/office/drawing/2016/5/12/chartex" xmlns:cx7="http://schemas.microsoft.com/office/drawing/2016/5/13/chartex" xmlns:cx8="http://schemas.microsoft.com/office/drawing/2016/5/14/chartex" xmlns:mc="http://schemas.openxmlformats.org/markup-compatibility/2006" xmlns:aink="http://schemas.microsoft.com/office/drawing/2016/ink" xmlns:am3d="http://schemas.microsoft.com/office/drawing/2017/model3d" xmlns:o="urn:schemas-microsoft-com:office:office" xmlns:oel="http://schemas.microsoft.com/office/2019/extlst" xmlns:r="http://schemas.openxmlformats.org/officeDocument/2006/relationships" xmlns:m="http://schemas.openxmlformats.org/officeDocument/2006/math" xmlns:v="urn:schemas-microsoft-com:vml" xmlns:wp14="http://schemas.microsoft.com/office/word/2010/wordprocessingDrawing" xmlns:wp="http://schemas.openxmlformats.org/drawingml/2006/wordprocessingDrawing" xmlns:w10="urn:schemas-microsoft-com:office:word" xmlns:w="http://schemas.openxmlformats.org/wordprocessingml/2006/main" xmlns:w14="http://schemas.microsoft.com/office/word/2010/wordml" xmlns:w15="http://schemas.microsoft.com/office/word/2012/wordml" xmlns:w16cex="http://schemas.microsoft.com/office/word/2018/wordml/cex" xmlns:w16cid="http://schemas.microsoft.com/office/word/2016/wordml/cid" xmlns:w16="http://schemas.microsoft.com/office/word/2018/wordml" xmlns:w16du="http://schemas.microsoft.com/office/word/2023/wordml/word16du" xmlns:w16sdtdh="http://schemas.microsoft.com/office/word/2020/wordml/sdtdatahash" xmlns:w16sdtfl="http://schemas.microsoft.com/office/word/2024/wordml/sdtformatlock" xmlns:w16se="http://schemas.microsoft.com/office/word/2015/wordml/symex" xmlns:wpg="http://schemas.microsoft.com/office/word/2010/wordprocessingGroup" xmlns:wpi="http://schemas.microsoft.com/office/word/2010/wordprocessingInk" xmlns:wne="http://schemas.microsoft.com/office/word/2006/wordml" xmlns:wps="http://schemas.microsoft.com/office/word/2010/wordprocessingShape" mc:Ignorable="w14 w15 w16se w16cid w16 w16cex w16sdtdh w16sdtfl w16du wp14">
+<w:numbering xmlns:wpc="http://schemas.microsoft.com/office/word/2010/wordprocessingCanvas" xmlns:cx="http://schemas.microsoft.com/office/drawing/2014/chartex" xmlns:cx1="http://schemas.microsoft.com/office/drawing/2015/9/8/chartex" xmlns:cx2="http://schemas.microsoft.com/office/drawing/2015/10/21/chartex" xmlns:cx3="http://schemas.microsoft.com/office/drawing/2016/5/9/chartex" xmlns:cx4="http://schemas.microsoft.com/office/drawing/2016/5/10/chartex" xmlns:cx5="http://schemas.microsoft.com/office/drawing/2016/5/11/chartex" xmlns:cx6="http://schemas.microsoft.com/office/drawing/2016/5/12/chartex" xmlns:cx7="http://schemas.microsoft.com/office/drawing/2016/5/13/chartex" xmlns:cx8="http://schemas.microsoft.com/office/drawing/2016/5/14/chartex" xmlns:mc="http://schemas.openxmlformats.org/markup-compatibility/2006" xmlns:m="http://schemas.openxmlformats.org/officeDocument/2006/math" xmlns:aink="http://schemas.microsoft.com/office/drawing/2016/ink" xmlns:am3d="http://schemas.microsoft.com/office/drawing/2017/model3d" xmlns:oel="http://schemas.microsoft.com/office/2019/extlst" xmlns:r="http://schemas.openxmlformats.org/officeDocument/2006/relationships" xmlns:wp14="http://schemas.microsoft.com/office/word/2010/wordprocessingDrawing" xmlns:wp="http://schemas.openxmlformats.org/drawingml/2006/wordprocessingDrawing" xmlns:wpg="http://schemas.microsoft.com/office/word/2010/wordprocessingGroup" xmlns:wpi="http://schemas.microsoft.com/office/word/2010/wordprocessingInk" xmlns:wps="http://schemas.microsoft.com/office/word/2010/wordprocessingShape" xmlns:o="urn:schemas-microsoft-com:office:office" xmlns:v="urn:schemas-microsoft-com:vml" xmlns:w10="urn:schemas-microsoft-com:office:word" xmlns:w="http://schemas.openxmlformats.org/wordprocessingml/2006/main" xmlns:w14="http://schemas.microsoft.com/office/word/2010/wordml" xmlns:w15="http://schemas.microsoft.com/office/word/2012/wordml" xmlns:w16cex="http://schemas.microsoft.com/office/word/2018/wordml/cex" xmlns:w16cid="http://schemas.microsoft.com/office/word/2016/wordml/cid" xmlns:w16="http://schemas.microsoft.com/office/word/2018/wordml" xmlns:w16sdtdh="http://schemas.microsoft.com/office/word/2020/wordml/sdtdatahash" xmlns:w16sdtfl="http://schemas.microsoft.com/office/word/2024/wordml/sdtformatlock" xmlns:w16se="http://schemas.microsoft.com/office/word/2015/wordml/symex" xmlns:w16du="http://schemas.microsoft.com/office/word/2023/wordml/word16du" xmlns:wne="http://schemas.microsoft.com/office/word/2006/wordml" mc:Ignorable="w14 w15 w16se w16cid w16 w16cex w16sdtdh w16sdtfl w16du wp14">
   <w:abstractNum w:abstractNumId="0" w15:restartNumberingAfterBreak="0">
     <w:nsid w:val="0215073E"/>
     <w:multiLevelType w:val="hybridMultilevel"/>
@@ -1418,6 +1255,92 @@
     </w:lvl>
   </w:abstractNum>
   <w:abstractNum w:abstractNumId="4" w15:restartNumberingAfterBreak="0">
+    <w:nsid w:val="25D6C547"/>
+    <w:multiLevelType w:val="hybridMultilevel"/>
+    <w:tmpl w:val="E6C6CBA8"/>
+    <w:lvl w:ilvl="0" w:tplc="A572AAAE">
+      <w:start w:val="1"/>
+      <w:numFmt w:val="decimal"/>
+      <w:lvlText w:val="%1."/>
+      <w:lvlJc w:val="left"/>
+      <w:pPr>
+        <w:ind w:left="720" w:hanging="360"/>
+      </w:pPr>
+    </w:lvl>
+    <w:lvl w:ilvl="1" w:tplc="734831D0">
+      <w:start w:val="1"/>
+      <w:numFmt w:val="lowerLetter"/>
+      <w:lvlText w:val="%2."/>
+      <w:lvlJc w:val="left"/>
+      <w:pPr>
+        <w:ind w:left="1440" w:hanging="360"/>
+      </w:pPr>
+    </w:lvl>
+    <w:lvl w:ilvl="2" w:tplc="886E5CAE">
+      <w:start w:val="1"/>
+      <w:numFmt w:val="lowerRoman"/>
+      <w:lvlText w:val="%3."/>
+      <w:lvlJc w:val="right"/>
+      <w:pPr>
+        <w:ind w:left="2160" w:hanging="180"/>
+      </w:pPr>
+    </w:lvl>
+    <w:lvl w:ilvl="3" w:tplc="E952AB94">
+      <w:start w:val="1"/>
+      <w:numFmt w:val="decimal"/>
+      <w:lvlText w:val="%4."/>
+      <w:lvlJc w:val="left"/>
+      <w:pPr>
+        <w:ind w:left="2880" w:hanging="360"/>
+      </w:pPr>
+    </w:lvl>
+    <w:lvl w:ilvl="4" w:tplc="00144976">
+      <w:start w:val="1"/>
+      <w:numFmt w:val="lowerLetter"/>
+      <w:lvlText w:val="%5."/>
+      <w:lvlJc w:val="left"/>
+      <w:pPr>
+        <w:ind w:left="3600" w:hanging="360"/>
+      </w:pPr>
+    </w:lvl>
+    <w:lvl w:ilvl="5" w:tplc="876A7558">
+      <w:start w:val="1"/>
+      <w:numFmt w:val="lowerRoman"/>
+      <w:lvlText w:val="%6."/>
+      <w:lvlJc w:val="right"/>
+      <w:pPr>
+        <w:ind w:left="4320" w:hanging="180"/>
+      </w:pPr>
+    </w:lvl>
+    <w:lvl w:ilvl="6" w:tplc="37B468B4">
+      <w:start w:val="1"/>
+      <w:numFmt w:val="decimal"/>
+      <w:lvlText w:val="%7."/>
+      <w:lvlJc w:val="left"/>
+      <w:pPr>
+        <w:ind w:left="5040" w:hanging="360"/>
+      </w:pPr>
+    </w:lvl>
+    <w:lvl w:ilvl="7" w:tplc="2E6653FE">
+      <w:start w:val="1"/>
+      <w:numFmt w:val="lowerLetter"/>
+      <w:lvlText w:val="%8."/>
+      <w:lvlJc w:val="left"/>
+      <w:pPr>
+        <w:ind w:left="5760" w:hanging="360"/>
+      </w:pPr>
+    </w:lvl>
+    <w:lvl w:ilvl="8" w:tplc="B06CC690">
+      <w:start w:val="1"/>
+      <w:numFmt w:val="lowerRoman"/>
+      <w:lvlText w:val="%9."/>
+      <w:lvlJc w:val="right"/>
+      <w:pPr>
+        <w:ind w:left="6480" w:hanging="180"/>
+      </w:pPr>
+    </w:lvl>
+  </w:abstractNum>
+  <w:abstractNum w:abstractNumId="5" w15:restartNumberingAfterBreak="0">
     <w:nsid w:val="37062059"/>
     <w:multiLevelType w:val="multilevel"/>
     <w:tmpl w:val="5BF41AAE"/>
@@ -1566,7 +1489,93 @@
       </w:rPr>
     </w:lvl>
   </w:abstractNum>
-  <w:abstractNum w:abstractNumId="5" w15:restartNumberingAfterBreak="0">
+  <w:abstractNum w:abstractNumId="6" w15:restartNumberingAfterBreak="0">
+    <w:nsid w:val="38C40DFC"/>
+    <w:multiLevelType w:val="hybridMultilevel"/>
+    <w:tmpl w:val="7180C92E"/>
+    <w:lvl w:ilvl="0" w:tplc="7B6C75BA">
+      <w:start w:val="1"/>
+      <w:numFmt w:val="decimal"/>
+      <w:lvlText w:val="%1."/>
+      <w:lvlJc w:val="left"/>
+      <w:pPr>
+        <w:ind w:left="720" w:hanging="360"/>
+      </w:pPr>
+    </w:lvl>
+    <w:lvl w:ilvl="1" w:tplc="C89A46F8">
+      <w:start w:val="1"/>
+      <w:numFmt w:val="lowerLetter"/>
+      <w:lvlText w:val="%2."/>
+      <w:lvlJc w:val="left"/>
+      <w:pPr>
+        <w:ind w:left="1440" w:hanging="360"/>
+      </w:pPr>
+    </w:lvl>
+    <w:lvl w:ilvl="2" w:tplc="10AA8D2A">
+      <w:start w:val="1"/>
+      <w:numFmt w:val="lowerRoman"/>
+      <w:lvlText w:val="%3."/>
+      <w:lvlJc w:val="right"/>
+      <w:pPr>
+        <w:ind w:left="2160" w:hanging="180"/>
+      </w:pPr>
+    </w:lvl>
+    <w:lvl w:ilvl="3" w:tplc="1DBC08BA">
+      <w:start w:val="1"/>
+      <w:numFmt w:val="decimal"/>
+      <w:lvlText w:val="%4."/>
+      <w:lvlJc w:val="left"/>
+      <w:pPr>
+        <w:ind w:left="2880" w:hanging="360"/>
+      </w:pPr>
+    </w:lvl>
+    <w:lvl w:ilvl="4" w:tplc="3A7ADBDE">
+      <w:start w:val="1"/>
+      <w:numFmt w:val="lowerLetter"/>
+      <w:lvlText w:val="%5."/>
+      <w:lvlJc w:val="left"/>
+      <w:pPr>
+        <w:ind w:left="3600" w:hanging="360"/>
+      </w:pPr>
+    </w:lvl>
+    <w:lvl w:ilvl="5" w:tplc="8F8A4D7A">
+      <w:start w:val="1"/>
+      <w:numFmt w:val="lowerRoman"/>
+      <w:lvlText w:val="%6."/>
+      <w:lvlJc w:val="right"/>
+      <w:pPr>
+        <w:ind w:left="4320" w:hanging="180"/>
+      </w:pPr>
+    </w:lvl>
+    <w:lvl w:ilvl="6" w:tplc="D9E0E60A">
+      <w:start w:val="1"/>
+      <w:numFmt w:val="decimal"/>
+      <w:lvlText w:val="%7."/>
+      <w:lvlJc w:val="left"/>
+      <w:pPr>
+        <w:ind w:left="5040" w:hanging="360"/>
+      </w:pPr>
+    </w:lvl>
+    <w:lvl w:ilvl="7" w:tplc="975ADB4A">
+      <w:start w:val="1"/>
+      <w:numFmt w:val="lowerLetter"/>
+      <w:lvlText w:val="%8."/>
+      <w:lvlJc w:val="left"/>
+      <w:pPr>
+        <w:ind w:left="5760" w:hanging="360"/>
+      </w:pPr>
+    </w:lvl>
+    <w:lvl w:ilvl="8" w:tplc="3F1A23CC">
+      <w:start w:val="1"/>
+      <w:numFmt w:val="lowerRoman"/>
+      <w:lvlText w:val="%9."/>
+      <w:lvlJc w:val="right"/>
+      <w:pPr>
+        <w:ind w:left="6480" w:hanging="180"/>
+      </w:pPr>
+    </w:lvl>
+  </w:abstractNum>
+  <w:abstractNum w:abstractNumId="7" w15:restartNumberingAfterBreak="0">
     <w:nsid w:val="3C123296"/>
     <w:multiLevelType w:val="multilevel"/>
     <w:tmpl w:val="E3E20DB8"/>
@@ -1715,7 +1724,120 @@
       </w:rPr>
     </w:lvl>
   </w:abstractNum>
-  <w:abstractNum w:abstractNumId="6" w15:restartNumberingAfterBreak="0">
+  <w:abstractNum w:abstractNumId="8" w15:restartNumberingAfterBreak="0">
+    <w:nsid w:val="3F4CF7AE"/>
+    <w:multiLevelType w:val="hybridMultilevel"/>
+    <w:tmpl w:val="A1C69DA2"/>
+    <w:lvl w:ilvl="0" w:tplc="EE0851C6">
+      <w:start w:val="1"/>
+      <w:numFmt w:val="bullet"/>
+      <w:lvlText w:val=""/>
+      <w:lvlJc w:val="left"/>
+      <w:pPr>
+        <w:ind w:left="720" w:hanging="360"/>
+      </w:pPr>
+      <w:rPr>
+        <w:rFonts w:ascii="Symbol" w:hAnsi="Symbol" w:hint="default"/>
+      </w:rPr>
+    </w:lvl>
+    <w:lvl w:ilvl="1" w:tplc="A13AC568">
+      <w:start w:val="1"/>
+      <w:numFmt w:val="bullet"/>
+      <w:lvlText w:val="o"/>
+      <w:lvlJc w:val="left"/>
+      <w:pPr>
+        <w:ind w:left="1440" w:hanging="360"/>
+      </w:pPr>
+      <w:rPr>
+        <w:rFonts w:ascii="Courier New" w:hAnsi="Courier New" w:hint="default"/>
+      </w:rPr>
+    </w:lvl>
+    <w:lvl w:ilvl="2" w:tplc="E1806F9A">
+      <w:start w:val="1"/>
+      <w:numFmt w:val="bullet"/>
+      <w:lvlText w:val=""/>
+      <w:lvlJc w:val="left"/>
+      <w:pPr>
+        <w:ind w:left="2160" w:hanging="360"/>
+      </w:pPr>
+      <w:rPr>
+        <w:rFonts w:ascii="Wingdings" w:hAnsi="Wingdings" w:hint="default"/>
+      </w:rPr>
+    </w:lvl>
+    <w:lvl w:ilvl="3" w:tplc="03AA0778">
+      <w:start w:val="1"/>
+      <w:numFmt w:val="bullet"/>
+      <w:lvlText w:val=""/>
+      <w:lvlJc w:val="left"/>
+      <w:pPr>
+        <w:ind w:left="2880" w:hanging="360"/>
+      </w:pPr>
+      <w:rPr>
+        <w:rFonts w:ascii="Symbol" w:hAnsi="Symbol" w:hint="default"/>
+      </w:rPr>
+    </w:lvl>
+    <w:lvl w:ilvl="4" w:tplc="CCE027F4">
+      <w:start w:val="1"/>
+      <w:numFmt w:val="bullet"/>
+      <w:lvlText w:val="o"/>
+      <w:lvlJc w:val="left"/>
+      <w:pPr>
+        <w:ind w:left="3600" w:hanging="360"/>
+      </w:pPr>
+      <w:rPr>
+        <w:rFonts w:ascii="Courier New" w:hAnsi="Courier New" w:hint="default"/>
+      </w:rPr>
+    </w:lvl>
+    <w:lvl w:ilvl="5" w:tplc="0E96E7FA">
+      <w:start w:val="1"/>
+      <w:numFmt w:val="bullet"/>
+      <w:lvlText w:val=""/>
+      <w:lvlJc w:val="left"/>
+      <w:pPr>
+        <w:ind w:left="4320" w:hanging="360"/>
+      </w:pPr>
+      <w:rPr>
+        <w:rFonts w:ascii="Wingdings" w:hAnsi="Wingdings" w:hint="default"/>
+      </w:rPr>
+    </w:lvl>
+    <w:lvl w:ilvl="6" w:tplc="26C6E75C">
+      <w:start w:val="1"/>
+      <w:numFmt w:val="bullet"/>
+      <w:lvlText w:val=""/>
+      <w:lvlJc w:val="left"/>
+      <w:pPr>
+        <w:ind w:left="5040" w:hanging="360"/>
+      </w:pPr>
+      <w:rPr>
+        <w:rFonts w:ascii="Symbol" w:hAnsi="Symbol" w:hint="default"/>
+      </w:rPr>
+    </w:lvl>
+    <w:lvl w:ilvl="7" w:tplc="6A8CD816">
+      <w:start w:val="1"/>
+      <w:numFmt w:val="bullet"/>
+      <w:lvlText w:val="o"/>
+      <w:lvlJc w:val="left"/>
+      <w:pPr>
+        <w:ind w:left="5760" w:hanging="360"/>
+      </w:pPr>
+      <w:rPr>
+        <w:rFonts w:ascii="Courier New" w:hAnsi="Courier New" w:hint="default"/>
+      </w:rPr>
+    </w:lvl>
+    <w:lvl w:ilvl="8" w:tplc="81AE56E0">
+      <w:start w:val="1"/>
+      <w:numFmt w:val="bullet"/>
+      <w:lvlText w:val=""/>
+      <w:lvlJc w:val="left"/>
+      <w:pPr>
+        <w:ind w:left="6480" w:hanging="360"/>
+      </w:pPr>
+      <w:rPr>
+        <w:rFonts w:ascii="Wingdings" w:hAnsi="Wingdings" w:hint="default"/>
+      </w:rPr>
+    </w:lvl>
+  </w:abstractNum>
+  <w:abstractNum w:abstractNumId="9" w15:restartNumberingAfterBreak="0">
     <w:nsid w:val="545F05B0"/>
     <w:multiLevelType w:val="multilevel"/>
     <w:tmpl w:val="A6547CEC"/>
@@ -1864,7 +1986,7 @@
       </w:rPr>
     </w:lvl>
   </w:abstractNum>
-  <w:abstractNum w:abstractNumId="7" w15:restartNumberingAfterBreak="0">
+  <w:abstractNum w:abstractNumId="10" w15:restartNumberingAfterBreak="0">
     <w:nsid w:val="5C1560B2"/>
     <w:multiLevelType w:val="multilevel"/>
     <w:tmpl w:val="9DC8A0FA"/>
@@ -2013,7 +2135,7 @@
       </w:rPr>
     </w:lvl>
   </w:abstractNum>
-  <w:abstractNum w:abstractNumId="8" w15:restartNumberingAfterBreak="0">
+  <w:abstractNum w:abstractNumId="11" w15:restartNumberingAfterBreak="0">
     <w:nsid w:val="742F0C8E"/>
     <w:multiLevelType w:val="multilevel"/>
     <w:tmpl w:val="BB9CD712"/>
@@ -2162,38 +2284,47 @@
       </w:rPr>
     </w:lvl>
   </w:abstractNum>
-  <w:num w:numId="1" w16cid:durableId="1842545508">
+  <w:num w:numId="1" w16cid:durableId="6639569">
+    <w:abstractNumId w:val="8"/>
+  </w:num>
+  <w:num w:numId="2" w16cid:durableId="721441332">
+    <w:abstractNumId w:val="4"/>
+  </w:num>
+  <w:num w:numId="3" w16cid:durableId="480267292">
+    <w:abstractNumId w:val="6"/>
+  </w:num>
+  <w:num w:numId="4" w16cid:durableId="1842545508">
     <w:abstractNumId w:val="1"/>
   </w:num>
-  <w:num w:numId="2" w16cid:durableId="1983001422">
-    <w:abstractNumId w:val="6"/>
+  <w:num w:numId="5" w16cid:durableId="1983001422">
+    <w:abstractNumId w:val="9"/>
   </w:num>
-  <w:num w:numId="3" w16cid:durableId="717434957">
-    <w:abstractNumId w:val="8"/>
+  <w:num w:numId="6" w16cid:durableId="717434957">
+    <w:abstractNumId w:val="11"/>
   </w:num>
-  <w:num w:numId="4" w16cid:durableId="1418402327">
+  <w:num w:numId="7" w16cid:durableId="1418402327">
+    <w:abstractNumId w:val="7"/>
+  </w:num>
+  <w:num w:numId="8" w16cid:durableId="308556755">
+    <w:abstractNumId w:val="3"/>
+  </w:num>
+  <w:num w:numId="9" w16cid:durableId="368797794">
+    <w:abstractNumId w:val="10"/>
+  </w:num>
+  <w:num w:numId="10" w16cid:durableId="84305590">
     <w:abstractNumId w:val="5"/>
   </w:num>
-  <w:num w:numId="5" w16cid:durableId="308556755">
-    <w:abstractNumId w:val="3"/>
-  </w:num>
-  <w:num w:numId="6" w16cid:durableId="368797794">
-    <w:abstractNumId w:val="7"/>
-  </w:num>
-  <w:num w:numId="7" w16cid:durableId="84305590">
-    <w:abstractNumId w:val="4"/>
-  </w:num>
-  <w:num w:numId="8" w16cid:durableId="1956400388">
+  <w:num w:numId="11" w16cid:durableId="1956400388">
     <w:abstractNumId w:val="2"/>
   </w:num>
-  <w:num w:numId="9" w16cid:durableId="109785734">
+  <w:num w:numId="12" w16cid:durableId="109785734">
     <w:abstractNumId w:val="0"/>
   </w:num>
 </w:numbering>
 </file>
 
 <file path=word/styles.xml><?xml version="1.0" encoding="utf-8"?>
-<w:styles xmlns:mc="http://schemas.openxmlformats.org/markup-compatibility/2006" xmlns:r="http://schemas.openxmlformats.org/officeDocument/2006/relationships" xmlns:w="http://schemas.openxmlformats.org/wordprocessingml/2006/main" xmlns:w14="http://schemas.microsoft.com/office/word/2010/wordml" xmlns:w15="http://schemas.microsoft.com/office/word/2012/wordml" xmlns:w16cex="http://schemas.microsoft.com/office/word/2018/wordml/cex" xmlns:w16cid="http://schemas.microsoft.com/office/word/2016/wordml/cid" xmlns:w16="http://schemas.microsoft.com/office/word/2018/wordml" xmlns:w16du="http://schemas.microsoft.com/office/word/2023/wordml/word16du" xmlns:w16sdtdh="http://schemas.microsoft.com/office/word/2020/wordml/sdtdatahash" xmlns:w16sdtfl="http://schemas.microsoft.com/office/word/2024/wordml/sdtformatlock" xmlns:w16se="http://schemas.microsoft.com/office/word/2015/wordml/symex" mc:Ignorable="w14 w15 w16se w16cid w16 w16cex w16sdtdh w16sdtfl w16du">
+<w:styles xmlns:mc="http://schemas.openxmlformats.org/markup-compatibility/2006" xmlns:r="http://schemas.openxmlformats.org/officeDocument/2006/relationships" xmlns:w="http://schemas.openxmlformats.org/wordprocessingml/2006/main" xmlns:w14="http://schemas.microsoft.com/office/word/2010/wordml" xmlns:w15="http://schemas.microsoft.com/office/word/2012/wordml" xmlns:w16cex="http://schemas.microsoft.com/office/word/2018/wordml/cex" xmlns:w16cid="http://schemas.microsoft.com/office/word/2016/wordml/cid" xmlns:w16="http://schemas.microsoft.com/office/word/2018/wordml" xmlns:w16sdtdh="http://schemas.microsoft.com/office/word/2020/wordml/sdtdatahash" xmlns:w16sdtfl="http://schemas.microsoft.com/office/word/2024/wordml/sdtformatlock" xmlns:w16se="http://schemas.microsoft.com/office/word/2015/wordml/symex" xmlns:w16du="http://schemas.microsoft.com/office/word/2023/wordml/word16du" mc:Ignorable="w14 w15 w16se w16cid w16 w16cex w16sdtdh w16sdtfl w16du">
   <w:docDefaults>
     <w:rPrDefault>
       <w:rPr>
@@ -2589,15 +2720,15 @@
     <w:lsdException w:name="Unresolved Mention" w:semiHidden="1" w:unhideWhenUsed="1"/>
     <w:lsdException w:name="Smart Link" w:semiHidden="1" w:unhideWhenUsed="1"/>
   </w:latentStyles>
-  <w:style w:type="paragraph" w:default="1" w:styleId="Normalny">
+  <w:style w:type="paragraph" w:default="1" w:styleId="Normal">
     <w:name w:val="Normal"/>
     <w:qFormat/>
   </w:style>
-  <w:style w:type="paragraph" w:styleId="Nagwek1">
+  <w:style w:type="paragraph" w:styleId="Heading1">
     <w:name w:val="heading 1"/>
-    <w:basedOn w:val="Normalny"/>
-    <w:next w:val="Normalny"/>
-    <w:link w:val="Nagwek1Znak"/>
+    <w:basedOn w:val="Normal"/>
+    <w:next w:val="Normal"/>
+    <w:link w:val="Heading1Char"/>
     <w:uiPriority w:val="9"/>
     <w:qFormat/>
     <w:rsid w:val="00F34C14"/>
@@ -2614,11 +2745,11 @@
       <w:szCs w:val="40"/>
     </w:rPr>
   </w:style>
-  <w:style w:type="paragraph" w:styleId="Nagwek2">
+  <w:style w:type="paragraph" w:styleId="Heading2">
     <w:name w:val="heading 2"/>
-    <w:basedOn w:val="Normalny"/>
-    <w:next w:val="Normalny"/>
-    <w:link w:val="Nagwek2Znak"/>
+    <w:basedOn w:val="Normal"/>
+    <w:next w:val="Normal"/>
+    <w:link w:val="Heading2Char"/>
     <w:uiPriority w:val="9"/>
     <w:semiHidden/>
     <w:unhideWhenUsed/>
@@ -2637,11 +2768,11 @@
       <w:szCs w:val="32"/>
     </w:rPr>
   </w:style>
-  <w:style w:type="paragraph" w:styleId="Nagwek3">
+  <w:style w:type="paragraph" w:styleId="Heading3">
     <w:name w:val="heading 3"/>
-    <w:basedOn w:val="Normalny"/>
-    <w:next w:val="Normalny"/>
-    <w:link w:val="Nagwek3Znak"/>
+    <w:basedOn w:val="Normal"/>
+    <w:next w:val="Normal"/>
+    <w:link w:val="Heading3Char"/>
     <w:uiPriority w:val="9"/>
     <w:semiHidden/>
     <w:unhideWhenUsed/>
@@ -2660,11 +2791,11 @@
       <w:szCs w:val="28"/>
     </w:rPr>
   </w:style>
-  <w:style w:type="paragraph" w:styleId="Nagwek4">
+  <w:style w:type="paragraph" w:styleId="Heading4">
     <w:name w:val="heading 4"/>
-    <w:basedOn w:val="Normalny"/>
-    <w:next w:val="Normalny"/>
-    <w:link w:val="Nagwek4Znak"/>
+    <w:basedOn w:val="Normal"/>
+    <w:next w:val="Normal"/>
+    <w:link w:val="Heading4Char"/>
     <w:uiPriority w:val="9"/>
     <w:semiHidden/>
     <w:unhideWhenUsed/>
@@ -2683,11 +2814,11 @@
       <w:color w:val="0F4761" w:themeColor="accent1" w:themeShade="BF"/>
     </w:rPr>
   </w:style>
-  <w:style w:type="paragraph" w:styleId="Nagwek5">
+  <w:style w:type="paragraph" w:styleId="Heading5">
     <w:name w:val="heading 5"/>
-    <w:basedOn w:val="Normalny"/>
-    <w:next w:val="Normalny"/>
-    <w:link w:val="Nagwek5Znak"/>
+    <w:basedOn w:val="Normal"/>
+    <w:next w:val="Normal"/>
+    <w:link w:val="Heading5Char"/>
     <w:uiPriority w:val="9"/>
     <w:semiHidden/>
     <w:unhideWhenUsed/>
@@ -2704,11 +2835,11 @@
       <w:color w:val="0F4761" w:themeColor="accent1" w:themeShade="BF"/>
     </w:rPr>
   </w:style>
-  <w:style w:type="paragraph" w:styleId="Nagwek6">
+  <w:style w:type="paragraph" w:styleId="Heading6">
     <w:name w:val="heading 6"/>
-    <w:basedOn w:val="Normalny"/>
-    <w:next w:val="Normalny"/>
-    <w:link w:val="Nagwek6Znak"/>
+    <w:basedOn w:val="Normal"/>
+    <w:next w:val="Normal"/>
+    <w:link w:val="Heading6Char"/>
     <w:uiPriority w:val="9"/>
     <w:semiHidden/>
     <w:unhideWhenUsed/>
@@ -2727,11 +2858,11 @@
       <w:color w:val="595959" w:themeColor="text1" w:themeTint="A6"/>
     </w:rPr>
   </w:style>
-  <w:style w:type="paragraph" w:styleId="Nagwek7">
+  <w:style w:type="paragraph" w:styleId="Heading7">
     <w:name w:val="heading 7"/>
-    <w:basedOn w:val="Normalny"/>
-    <w:next w:val="Normalny"/>
-    <w:link w:val="Nagwek7Znak"/>
+    <w:basedOn w:val="Normal"/>
+    <w:next w:val="Normal"/>
+    <w:link w:val="Heading7Char"/>
     <w:uiPriority w:val="9"/>
     <w:semiHidden/>
     <w:unhideWhenUsed/>
@@ -2748,11 +2879,11 @@
       <w:color w:val="595959" w:themeColor="text1" w:themeTint="A6"/>
     </w:rPr>
   </w:style>
-  <w:style w:type="paragraph" w:styleId="Nagwek8">
+  <w:style w:type="paragraph" w:styleId="Heading8">
     <w:name w:val="heading 8"/>
-    <w:basedOn w:val="Normalny"/>
-    <w:next w:val="Normalny"/>
-    <w:link w:val="Nagwek8Znak"/>
+    <w:basedOn w:val="Normal"/>
+    <w:next w:val="Normal"/>
+    <w:link w:val="Heading8Char"/>
     <w:uiPriority w:val="9"/>
     <w:semiHidden/>
     <w:unhideWhenUsed/>
@@ -2771,11 +2902,11 @@
       <w:color w:val="272727" w:themeColor="text1" w:themeTint="D8"/>
     </w:rPr>
   </w:style>
-  <w:style w:type="paragraph" w:styleId="Nagwek9">
+  <w:style w:type="paragraph" w:styleId="Heading9">
     <w:name w:val="heading 9"/>
-    <w:basedOn w:val="Normalny"/>
-    <w:next w:val="Normalny"/>
-    <w:link w:val="Nagwek9Znak"/>
+    <w:basedOn w:val="Normal"/>
+    <w:next w:val="Normal"/>
+    <w:link w:val="Heading9Char"/>
     <w:uiPriority w:val="9"/>
     <w:semiHidden/>
     <w:unhideWhenUsed/>
@@ -2792,12 +2923,13 @@
       <w:color w:val="272727" w:themeColor="text1" w:themeTint="D8"/>
     </w:rPr>
   </w:style>
-  <w:style w:type="character" w:default="1" w:styleId="Domylnaczcionkaakapitu">
+  <w:style w:type="character" w:default="1" w:styleId="DefaultParagraphFont">
     <w:name w:val="Default Paragraph Font"/>
     <w:uiPriority w:val="1"/>
+    <w:semiHidden/>
     <w:unhideWhenUsed/>
   </w:style>
-  <w:style w:type="table" w:default="1" w:styleId="Standardowy">
+  <w:style w:type="table" w:default="1" w:styleId="TableNormal">
     <w:name w:val="Normal Table"/>
     <w:uiPriority w:val="99"/>
     <w:semiHidden/>
@@ -2812,16 +2944,16 @@
       </w:tblCellMar>
     </w:tblPr>
   </w:style>
-  <w:style w:type="numbering" w:default="1" w:styleId="Bezlisty">
+  <w:style w:type="numbering" w:default="1" w:styleId="NoList">
     <w:name w:val="No List"/>
     <w:uiPriority w:val="99"/>
     <w:semiHidden/>
     <w:unhideWhenUsed/>
   </w:style>
-  <w:style w:type="character" w:customStyle="1" w:styleId="Nagwek1Znak">
-    <w:name w:val="Nagłówek 1 Znak"/>
-    <w:basedOn w:val="Domylnaczcionkaakapitu"/>
-    <w:link w:val="Nagwek1"/>
+  <w:style w:type="character" w:customStyle="1" w:styleId="Heading1Char">
+    <w:name w:val="Heading 1 Char"/>
+    <w:basedOn w:val="DefaultParagraphFont"/>
+    <w:link w:val="Heading1"/>
     <w:uiPriority w:val="9"/>
     <w:rsid w:val="00F34C14"/>
     <w:rPr>
@@ -2831,10 +2963,10 @@
       <w:szCs w:val="40"/>
     </w:rPr>
   </w:style>
-  <w:style w:type="character" w:customStyle="1" w:styleId="Nagwek2Znak">
-    <w:name w:val="Nagłówek 2 Znak"/>
-    <w:basedOn w:val="Domylnaczcionkaakapitu"/>
-    <w:link w:val="Nagwek2"/>
+  <w:style w:type="character" w:customStyle="1" w:styleId="Heading2Char">
+    <w:name w:val="Heading 2 Char"/>
+    <w:basedOn w:val="DefaultParagraphFont"/>
+    <w:link w:val="Heading2"/>
     <w:uiPriority w:val="9"/>
     <w:semiHidden/>
     <w:rsid w:val="00F34C14"/>
@@ -2845,10 +2977,10 @@
       <w:szCs w:val="32"/>
     </w:rPr>
   </w:style>
-  <w:style w:type="character" w:customStyle="1" w:styleId="Nagwek3Znak">
-    <w:name w:val="Nagłówek 3 Znak"/>
-    <w:basedOn w:val="Domylnaczcionkaakapitu"/>
-    <w:link w:val="Nagwek3"/>
+  <w:style w:type="character" w:customStyle="1" w:styleId="Heading3Char">
+    <w:name w:val="Heading 3 Char"/>
+    <w:basedOn w:val="DefaultParagraphFont"/>
+    <w:link w:val="Heading3"/>
     <w:uiPriority w:val="9"/>
     <w:semiHidden/>
     <w:rsid w:val="00F34C14"/>
@@ -2859,10 +2991,10 @@
       <w:szCs w:val="28"/>
     </w:rPr>
   </w:style>
-  <w:style w:type="character" w:customStyle="1" w:styleId="Nagwek4Znak">
-    <w:name w:val="Nagłówek 4 Znak"/>
-    <w:basedOn w:val="Domylnaczcionkaakapitu"/>
-    <w:link w:val="Nagwek4"/>
+  <w:style w:type="character" w:customStyle="1" w:styleId="Heading4Char">
+    <w:name w:val="Heading 4 Char"/>
+    <w:basedOn w:val="DefaultParagraphFont"/>
+    <w:link w:val="Heading4"/>
     <w:uiPriority w:val="9"/>
     <w:semiHidden/>
     <w:rsid w:val="00F34C14"/>
@@ -2873,10 +3005,10 @@
       <w:color w:val="0F4761" w:themeColor="accent1" w:themeShade="BF"/>
     </w:rPr>
   </w:style>
-  <w:style w:type="character" w:customStyle="1" w:styleId="Nagwek5Znak">
-    <w:name w:val="Nagłówek 5 Znak"/>
-    <w:basedOn w:val="Domylnaczcionkaakapitu"/>
-    <w:link w:val="Nagwek5"/>
+  <w:style w:type="character" w:customStyle="1" w:styleId="Heading5Char">
+    <w:name w:val="Heading 5 Char"/>
+    <w:basedOn w:val="DefaultParagraphFont"/>
+    <w:link w:val="Heading5"/>
     <w:uiPriority w:val="9"/>
     <w:semiHidden/>
     <w:rsid w:val="00F34C14"/>
@@ -2885,10 +3017,10 @@
       <w:color w:val="0F4761" w:themeColor="accent1" w:themeShade="BF"/>
     </w:rPr>
   </w:style>
-  <w:style w:type="character" w:customStyle="1" w:styleId="Nagwek6Znak">
-    <w:name w:val="Nagłówek 6 Znak"/>
-    <w:basedOn w:val="Domylnaczcionkaakapitu"/>
-    <w:link w:val="Nagwek6"/>
+  <w:style w:type="character" w:customStyle="1" w:styleId="Heading6Char">
+    <w:name w:val="Heading 6 Char"/>
+    <w:basedOn w:val="DefaultParagraphFont"/>
+    <w:link w:val="Heading6"/>
     <w:uiPriority w:val="9"/>
     <w:semiHidden/>
     <w:rsid w:val="00F34C14"/>
@@ -2899,10 +3031,10 @@
       <w:color w:val="595959" w:themeColor="text1" w:themeTint="A6"/>
     </w:rPr>
   </w:style>
-  <w:style w:type="character" w:customStyle="1" w:styleId="Nagwek7Znak">
-    <w:name w:val="Nagłówek 7 Znak"/>
-    <w:basedOn w:val="Domylnaczcionkaakapitu"/>
-    <w:link w:val="Nagwek7"/>
+  <w:style w:type="character" w:customStyle="1" w:styleId="Heading7Char">
+    <w:name w:val="Heading 7 Char"/>
+    <w:basedOn w:val="DefaultParagraphFont"/>
+    <w:link w:val="Heading7"/>
     <w:uiPriority w:val="9"/>
     <w:semiHidden/>
     <w:rsid w:val="00F34C14"/>
@@ -2911,10 +3043,10 @@
       <w:color w:val="595959" w:themeColor="text1" w:themeTint="A6"/>
     </w:rPr>
   </w:style>
-  <w:style w:type="character" w:customStyle="1" w:styleId="Nagwek8Znak">
-    <w:name w:val="Nagłówek 8 Znak"/>
-    <w:basedOn w:val="Domylnaczcionkaakapitu"/>
-    <w:link w:val="Nagwek8"/>
+  <w:style w:type="character" w:customStyle="1" w:styleId="Heading8Char">
+    <w:name w:val="Heading 8 Char"/>
+    <w:basedOn w:val="DefaultParagraphFont"/>
+    <w:link w:val="Heading8"/>
     <w:uiPriority w:val="9"/>
     <w:semiHidden/>
     <w:rsid w:val="00F34C14"/>
@@ -2925,10 +3057,10 @@
       <w:color w:val="272727" w:themeColor="text1" w:themeTint="D8"/>
     </w:rPr>
   </w:style>
-  <w:style w:type="character" w:customStyle="1" w:styleId="Nagwek9Znak">
-    <w:name w:val="Nagłówek 9 Znak"/>
-    <w:basedOn w:val="Domylnaczcionkaakapitu"/>
-    <w:link w:val="Nagwek9"/>
+  <w:style w:type="character" w:customStyle="1" w:styleId="Heading9Char">
+    <w:name w:val="Heading 9 Char"/>
+    <w:basedOn w:val="DefaultParagraphFont"/>
+    <w:link w:val="Heading9"/>
     <w:uiPriority w:val="9"/>
     <w:semiHidden/>
     <w:rsid w:val="00F34C14"/>
@@ -2937,11 +3069,11 @@
       <w:color w:val="272727" w:themeColor="text1" w:themeTint="D8"/>
     </w:rPr>
   </w:style>
-  <w:style w:type="paragraph" w:styleId="Tytu">
+  <w:style w:type="paragraph" w:styleId="Title">
     <w:name w:val="Title"/>
-    <w:basedOn w:val="Normalny"/>
-    <w:next w:val="Normalny"/>
-    <w:link w:val="TytuZnak"/>
+    <w:basedOn w:val="Normal"/>
+    <w:next w:val="Normal"/>
+    <w:link w:val="TitleChar"/>
     <w:uiPriority w:val="10"/>
     <w:qFormat/>
     <w:rsid w:val="00F34C14"/>
@@ -2957,10 +3089,10 @@
       <w:szCs w:val="56"/>
     </w:rPr>
   </w:style>
-  <w:style w:type="character" w:customStyle="1" w:styleId="TytuZnak">
-    <w:name w:val="Tytuł Znak"/>
-    <w:basedOn w:val="Domylnaczcionkaakapitu"/>
-    <w:link w:val="Tytu"/>
+  <w:style w:type="character" w:customStyle="1" w:styleId="TitleChar">
+    <w:name w:val="Title Char"/>
+    <w:basedOn w:val="DefaultParagraphFont"/>
+    <w:link w:val="Title"/>
     <w:uiPriority w:val="10"/>
     <w:rsid w:val="00F34C14"/>
     <w:rPr>
@@ -2971,11 +3103,11 @@
       <w:szCs w:val="56"/>
     </w:rPr>
   </w:style>
-  <w:style w:type="paragraph" w:styleId="Podtytu">
+  <w:style w:type="paragraph" w:styleId="Subtitle">
     <w:name w:val="Subtitle"/>
-    <w:basedOn w:val="Normalny"/>
-    <w:next w:val="Normalny"/>
-    <w:link w:val="PodtytuZnak"/>
+    <w:basedOn w:val="Normal"/>
+    <w:next w:val="Normal"/>
+    <w:link w:val="SubtitleChar"/>
     <w:uiPriority w:val="11"/>
     <w:qFormat/>
     <w:rsid w:val="00F34C14"/>
@@ -2992,10 +3124,10 @@
       <w:szCs w:val="28"/>
     </w:rPr>
   </w:style>
-  <w:style w:type="character" w:customStyle="1" w:styleId="PodtytuZnak">
-    <w:name w:val="Podtytuł Znak"/>
-    <w:basedOn w:val="Domylnaczcionkaakapitu"/>
-    <w:link w:val="Podtytu"/>
+  <w:style w:type="character" w:customStyle="1" w:styleId="SubtitleChar">
+    <w:name w:val="Subtitle Char"/>
+    <w:basedOn w:val="DefaultParagraphFont"/>
+    <w:link w:val="Subtitle"/>
     <w:uiPriority w:val="11"/>
     <w:rsid w:val="00F34C14"/>
     <w:rPr>
@@ -3006,11 +3138,11 @@
       <w:szCs w:val="28"/>
     </w:rPr>
   </w:style>
-  <w:style w:type="paragraph" w:styleId="Cytat">
+  <w:style w:type="paragraph" w:styleId="Quote">
     <w:name w:val="Quote"/>
-    <w:basedOn w:val="Normalny"/>
-    <w:next w:val="Normalny"/>
-    <w:link w:val="CytatZnak"/>
+    <w:basedOn w:val="Normal"/>
+    <w:next w:val="Normal"/>
+    <w:link w:val="QuoteChar"/>
     <w:uiPriority w:val="29"/>
     <w:qFormat/>
     <w:rsid w:val="00F34C14"/>
@@ -3024,10 +3156,10 @@
       <w:color w:val="404040" w:themeColor="text1" w:themeTint="BF"/>
     </w:rPr>
   </w:style>
-  <w:style w:type="character" w:customStyle="1" w:styleId="CytatZnak">
-    <w:name w:val="Cytat Znak"/>
-    <w:basedOn w:val="Domylnaczcionkaakapitu"/>
-    <w:link w:val="Cytat"/>
+  <w:style w:type="character" w:customStyle="1" w:styleId="QuoteChar">
+    <w:name w:val="Quote Char"/>
+    <w:basedOn w:val="DefaultParagraphFont"/>
+    <w:link w:val="Quote"/>
     <w:uiPriority w:val="29"/>
     <w:rsid w:val="00F34C14"/>
     <w:rPr>
@@ -3036,9 +3168,9 @@
       <w:color w:val="404040" w:themeColor="text1" w:themeTint="BF"/>
     </w:rPr>
   </w:style>
-  <w:style w:type="paragraph" w:styleId="Akapitzlist">
+  <w:style w:type="paragraph" w:styleId="ListParagraph">
     <w:name w:val="List Paragraph"/>
-    <w:basedOn w:val="Normalny"/>
+    <w:basedOn w:val="Normal"/>
     <w:uiPriority w:val="34"/>
     <w:qFormat/>
     <w:rsid w:val="00F34C14"/>
@@ -3047,9 +3179,9 @@
       <w:contextualSpacing/>
     </w:pPr>
   </w:style>
-  <w:style w:type="character" w:styleId="Wyrnienieintensywne">
+  <w:style w:type="character" w:styleId="IntenseEmphasis">
     <w:name w:val="Intense Emphasis"/>
-    <w:basedOn w:val="Domylnaczcionkaakapitu"/>
+    <w:basedOn w:val="DefaultParagraphFont"/>
     <w:uiPriority w:val="21"/>
     <w:qFormat/>
     <w:rsid w:val="00F34C14"/>
@@ -3059,11 +3191,11 @@
       <w:color w:val="0F4761" w:themeColor="accent1" w:themeShade="BF"/>
     </w:rPr>
   </w:style>
-  <w:style w:type="paragraph" w:styleId="Cytatintensywny">
+  <w:style w:type="paragraph" w:styleId="IntenseQuote">
     <w:name w:val="Intense Quote"/>
-    <w:basedOn w:val="Normalny"/>
-    <w:next w:val="Normalny"/>
-    <w:link w:val="CytatintensywnyZnak"/>
+    <w:basedOn w:val="Normal"/>
+    <w:next w:val="Normal"/>
+    <w:link w:val="IntenseQuoteChar"/>
     <w:uiPriority w:val="30"/>
     <w:qFormat/>
     <w:rsid w:val="00F34C14"/>
@@ -3082,10 +3214,10 @@
       <w:color w:val="0F4761" w:themeColor="accent1" w:themeShade="BF"/>
     </w:rPr>
   </w:style>
-  <w:style w:type="character" w:customStyle="1" w:styleId="CytatintensywnyZnak">
-    <w:name w:val="Cytat intensywny Znak"/>
-    <w:basedOn w:val="Domylnaczcionkaakapitu"/>
-    <w:link w:val="Cytatintensywny"/>
+  <w:style w:type="character" w:customStyle="1" w:styleId="IntenseQuoteChar">
+    <w:name w:val="Intense Quote Char"/>
+    <w:basedOn w:val="DefaultParagraphFont"/>
+    <w:link w:val="IntenseQuote"/>
     <w:uiPriority w:val="30"/>
     <w:rsid w:val="00F34C14"/>
     <w:rPr>
@@ -3094,9 +3226,9 @@
       <w:color w:val="0F4761" w:themeColor="accent1" w:themeShade="BF"/>
     </w:rPr>
   </w:style>
-  <w:style w:type="character" w:styleId="Odwoanieintensywne">
+  <w:style w:type="character" w:styleId="IntenseReference">
     <w:name w:val="Intense Reference"/>
-    <w:basedOn w:val="Domylnaczcionkaakapitu"/>
+    <w:basedOn w:val="DefaultParagraphFont"/>
     <w:uiPriority w:val="32"/>
     <w:qFormat/>
     <w:rsid w:val="00F34C14"/>
@@ -3108,9 +3240,9 @@
       <w:spacing w:val="5"/>
     </w:rPr>
   </w:style>
-  <w:style w:type="character" w:styleId="Hipercze">
+  <w:style w:type="character" w:styleId="Hyperlink">
     <w:name w:val="Hyperlink"/>
-    <w:basedOn w:val="Domylnaczcionkaakapitu"/>
+    <w:basedOn w:val="DefaultParagraphFont"/>
     <w:uiPriority w:val="99"/>
     <w:unhideWhenUsed/>
     <w:rsid w:val="001C0D69"/>
@@ -3119,9 +3251,9 @@
       <w:u w:val="single"/>
     </w:rPr>
   </w:style>
-  <w:style w:type="character" w:styleId="Nierozpoznanawzmianka">
+  <w:style w:type="character" w:styleId="UnresolvedMention">
     <w:name w:val="Unresolved Mention"/>
-    <w:basedOn w:val="Domylnaczcionkaakapitu"/>
+    <w:basedOn w:val="DefaultParagraphFont"/>
     <w:uiPriority w:val="99"/>
     <w:semiHidden/>
     <w:unhideWhenUsed/>
@@ -3129,6 +3261,62 @@
     <w:rPr>
       <w:color w:val="605E5C"/>
       <w:shd w:val="clear" w:color="auto" w:fill="E1DFDD"/>
+    </w:rPr>
+  </w:style>
+  <w:style w:type="table" w:styleId="TableGrid">
+    <w:name w:val="Table Grid"/>
+    <w:basedOn w:val="TableNormal"/>
+    <w:uiPriority w:val="59"/>
+    <w:rsid w:val="00FB4123"/>
+    <w:pPr>
+      <w:spacing w:after="0" w:line="240" w:lineRule="auto"/>
+    </w:pPr>
+    <w:tblPr>
+      <w:tblBorders>
+        <w:top w:val="single" w:sz="4" w:space="0" w:color="000000" w:themeColor="text1"/>
+        <w:left w:val="single" w:sz="4" w:space="0" w:color="000000" w:themeColor="text1"/>
+        <w:bottom w:val="single" w:sz="4" w:space="0" w:color="000000" w:themeColor="text1"/>
+        <w:right w:val="single" w:sz="4" w:space="0" w:color="000000" w:themeColor="text1"/>
+        <w:insideH w:val="single" w:sz="4" w:space="0" w:color="000000" w:themeColor="text1"/>
+        <w:insideV w:val="single" w:sz="4" w:space="0" w:color="000000" w:themeColor="text1"/>
+      </w:tblBorders>
+    </w:tblPr>
+  </w:style>
+  <w:style w:type="paragraph" w:styleId="CommentText">
+    <w:name w:val="annotation text"/>
+    <w:basedOn w:val="Normal"/>
+    <w:link w:val="CommentTextChar"/>
+    <w:uiPriority w:val="99"/>
+    <w:semiHidden/>
+    <w:unhideWhenUsed/>
+    <w:pPr>
+      <w:spacing w:line="240" w:lineRule="auto"/>
+    </w:pPr>
+    <w:rPr>
+      <w:sz w:val="20"/>
+      <w:szCs w:val="20"/>
+    </w:rPr>
+  </w:style>
+  <w:style w:type="character" w:customStyle="1" w:styleId="CommentTextChar">
+    <w:name w:val="Comment Text Char"/>
+    <w:basedOn w:val="DefaultParagraphFont"/>
+    <w:link w:val="CommentText"/>
+    <w:uiPriority w:val="99"/>
+    <w:semiHidden/>
+    <w:rPr>
+      <w:sz w:val="20"/>
+      <w:szCs w:val="20"/>
+    </w:rPr>
+  </w:style>
+  <w:style w:type="character" w:styleId="CommentReference">
+    <w:name w:val="annotation reference"/>
+    <w:basedOn w:val="DefaultParagraphFont"/>
+    <w:uiPriority w:val="99"/>
+    <w:semiHidden/>
+    <w:unhideWhenUsed/>
+    <w:rPr>
+      <w:sz w:val="16"/>
+      <w:szCs w:val="16"/>
     </w:rPr>
   </w:style>
 </w:styles>

</xml_diff>